<commit_message>
Integrate Zhang findings from group archive
</commit_message>
<xml_diff>
--- a/final_report_group6.docx
+++ b/final_report_group6.docx
@@ -2,7 +2,7 @@
 <file path=word/document.xml><?xml version="1.0" encoding="utf-8"?>
 <w:document xmlns:w="http://schemas.openxmlformats.org/wordprocessingml/2006/main" xmlns:m="http://schemas.openxmlformats.org/officeDocument/2006/math" xmlns:r="http://schemas.openxmlformats.org/officeDocument/2006/relationships" xmlns:o="urn:schemas-microsoft-com:office:office" xmlns:v="urn:schemas-microsoft-com:vml" xmlns:w10="urn:schemas-microsoft-com:office:word" xmlns:a="http://schemas.openxmlformats.org/drawingml/2006/main" xmlns:pic="http://schemas.openxmlformats.org/drawingml/2006/picture" xmlns:wp="http://schemas.openxmlformats.org/drawingml/2006/wordprocessingDrawing">
   <w:body>
-    <w:bookmarkStart w:id="51" w:name="X6da2be22d6ba581b687f979558f8f5586648e39"/>
+    <w:bookmarkStart w:id="54" w:name="X6da2be22d6ba581b687f979558f8f5586648e39"/>
     <w:p>
       <w:pPr>
         <w:pStyle w:val="Heading1"/>
@@ -3231,7 +3231,7 @@
     </w:p>
     <w:bookmarkEnd w:id="31"/>
     <w:bookmarkEnd w:id="32"/>
-    <w:bookmarkStart w:id="40" w:name="results"/>
+    <w:bookmarkStart w:id="43" w:name="results"/>
     <w:p>
       <w:pPr>
         <w:pStyle w:val="Heading2"/>
@@ -4197,7 +4197,7 @@
       </w:r>
     </w:p>
     <w:bookmarkEnd w:id="35"/>
-    <w:bookmarkStart w:id="37" w:name="trust-ratings-and-attitudes"/>
+    <w:bookmarkStart w:id="38" w:name="trust-ratings-and-attitudes"/>
     <w:p>
       <w:pPr>
         <w:pStyle w:val="Heading3"/>
@@ -4886,9 +4886,239 @@
         </w:rPr>
         <w:drawing>
           <wp:inline>
+            <wp:extent cx="5334000" cy="4107793"/>
+            <wp:effectExtent b="0" l="0" r="0" t="0"/>
+            <wp:docPr descr="Figure 3. Mean trust rating by image source." title="" id="1" name="Picture"/>
+            <a:graphic>
+              <a:graphicData uri="http://schemas.openxmlformats.org/drawingml/2006/picture">
+                <pic:pic>
+                  <pic:nvPicPr>
+                    <pic:cNvPr descr="trust_by_source.png" id="0" name="Picture"/>
+                    <pic:cNvPicPr>
+                      <a:picLocks noChangeArrowheads="1" noChangeAspect="1"/>
+                    </pic:cNvPicPr>
+                  </pic:nvPicPr>
+                  <pic:blipFill>
+                    <a:blip r:embed="rId36"/>
+                    <a:stretch>
+                      <a:fillRect/>
+                    </a:stretch>
+                  </pic:blipFill>
+                  <pic:spPr bwMode="auto">
+                    <a:xfrm>
+                      <a:off x="0" y="0"/>
+                      <a:ext cx="5334000" cy="4107793"/>
+                    </a:xfrm>
+                    <a:prstGeom prst="rect">
+                      <a:avLst/>
+                    </a:prstGeom>
+                    <a:noFill/>
+                    <a:ln w="9525">
+                      <a:noFill/>
+                      <a:headEnd/>
+                      <a:tailEnd/>
+                    </a:ln>
+                  </pic:spPr>
+                </pic:pic>
+              </a:graphicData>
+            </a:graphic>
+          </wp:inline>
+        </w:drawing>
+      </w:r>
+    </w:p>
+    <w:p>
+      <w:pPr>
+        <w:pStyle w:val="ImageCaption"/>
+        <w:keepNext w:val="0"/>
+        <w:spacing w:line="480" w:lineRule="auto" w:before="0" w:after="0"/>
+        <w:jc w:val="center"/>
+      </w:pPr>
+      <w:r>
+        <w:rPr>
+          <w:rFonts w:ascii="Times New Roman" w:hAnsi="Times New Roman" w:eastAsia="Times New Roman"/>
+          <w:b/>
+          <w:color w:val="000000"/>
+          <w:sz w:val="22"/>
+        </w:rPr>
+        <w:t xml:space="preserve">Figure 3. Mean trust rating by image source.</w:t>
+      </w:r>
+    </w:p>
+    <w:p>
+      <w:pPr>
+        <w:pStyle w:val="BodyText"/>
+        <w:keepNext w:val="0"/>
+        <w:spacing w:line="480" w:lineRule="auto" w:before="0" w:after="0"/>
+      </w:pPr>
+      <w:r>
+        <w:rPr>
+          <w:rFonts w:ascii="Times New Roman" w:hAnsi="Times New Roman" w:eastAsia="Times New Roman"/>
+          <w:color w:val="000000"/>
+          <w:sz w:val="22"/>
+        </w:rPr>
+        <w:t xml:space="preserve">The source-level trust result shows a cautious rather than sharply divided pattern. Real</w:t>
+      </w:r>
+      <w:r>
+        <w:rPr>
+          <w:rFonts w:ascii="Times New Roman" w:hAnsi="Times New Roman" w:eastAsia="Times New Roman"/>
+          <w:color w:val="000000"/>
+          <w:sz w:val="22"/>
+        </w:rPr>
+        <w:t xml:space="preserve"> </w:t>
+      </w:r>
+      <w:r>
+        <w:rPr>
+          <w:rFonts w:ascii="Times New Roman" w:hAnsi="Times New Roman" w:eastAsia="Times New Roman"/>
+          <w:color w:val="000000"/>
+          <w:sz w:val="22"/>
+        </w:rPr>
+        <w:t xml:space="preserve">images and screenshots were rated somewhat more trustworthy than AI-generated images, but</w:t>
+      </w:r>
+      <w:r>
+        <w:rPr>
+          <w:rFonts w:ascii="Times New Roman" w:hAnsi="Times New Roman" w:eastAsia="Times New Roman"/>
+          <w:color w:val="000000"/>
+          <w:sz w:val="22"/>
+        </w:rPr>
+        <w:t xml:space="preserve"> </w:t>
+      </w:r>
+      <w:r>
+        <w:rPr>
+          <w:rFonts w:ascii="Times New Roman" w:hAnsi="Times New Roman" w:eastAsia="Times New Roman"/>
+          <w:color w:val="000000"/>
+          <w:sz w:val="22"/>
+        </w:rPr>
+        <w:t xml:space="preserve">both means remained close to the midpoint of the scale. This suggests that respondents did</w:t>
+      </w:r>
+      <w:r>
+        <w:rPr>
+          <w:rFonts w:ascii="Times New Roman" w:hAnsi="Times New Roman" w:eastAsia="Times New Roman"/>
+          <w:color w:val="000000"/>
+          <w:sz w:val="22"/>
+        </w:rPr>
+        <w:t xml:space="preserve"> </w:t>
+      </w:r>
+      <w:r>
+        <w:rPr>
+          <w:rFonts w:ascii="Times New Roman" w:hAnsi="Times New Roman" w:eastAsia="Times New Roman"/>
+          <w:color w:val="000000"/>
+          <w:sz w:val="22"/>
+        </w:rPr>
+        <w:t xml:space="preserve">not treat</w:t>
+      </w:r>
+      <w:r>
+        <w:rPr>
+          <w:rFonts w:ascii="Times New Roman" w:hAnsi="Times New Roman" w:eastAsia="Times New Roman"/>
+          <w:color w:val="000000"/>
+          <w:sz w:val="22"/>
+        </w:rPr>
+        <w:t xml:space="preserve"> </w:t>
+      </w:r>
+      <w:r>
+        <w:rPr>
+          <w:rFonts w:ascii="Times New Roman" w:hAnsi="Times New Roman" w:eastAsia="Times New Roman"/>
+          <w:color w:val="000000"/>
+          <w:sz w:val="22"/>
+        </w:rPr>
+        <w:t xml:space="preserve">“</w:t>
+      </w:r>
+      <w:r>
+        <w:rPr>
+          <w:rFonts w:ascii="Times New Roman" w:hAnsi="Times New Roman" w:eastAsia="Times New Roman"/>
+          <w:color w:val="000000"/>
+          <w:sz w:val="22"/>
+        </w:rPr>
+        <w:t xml:space="preserve">real</w:t>
+      </w:r>
+      <w:r>
+        <w:rPr>
+          <w:rFonts w:ascii="Times New Roman" w:hAnsi="Times New Roman" w:eastAsia="Times New Roman"/>
+          <w:color w:val="000000"/>
+          <w:sz w:val="22"/>
+        </w:rPr>
+        <w:t xml:space="preserve">”</w:t>
+      </w:r>
+      <w:r>
+        <w:rPr>
+          <w:rFonts w:ascii="Times New Roman" w:hAnsi="Times New Roman" w:eastAsia="Times New Roman"/>
+          <w:color w:val="000000"/>
+          <w:sz w:val="22"/>
+        </w:rPr>
+        <w:t xml:space="preserve"> </w:t>
+      </w:r>
+      <w:r>
+        <w:rPr>
+          <w:rFonts w:ascii="Times New Roman" w:hAnsi="Times New Roman" w:eastAsia="Times New Roman"/>
+          <w:color w:val="000000"/>
+          <w:sz w:val="22"/>
+        </w:rPr>
+        <w:t xml:space="preserve">and</w:t>
+      </w:r>
+      <w:r>
+        <w:rPr>
+          <w:rFonts w:ascii="Times New Roman" w:hAnsi="Times New Roman" w:eastAsia="Times New Roman"/>
+          <w:color w:val="000000"/>
+          <w:sz w:val="22"/>
+        </w:rPr>
+        <w:t xml:space="preserve"> </w:t>
+      </w:r>
+      <w:r>
+        <w:rPr>
+          <w:rFonts w:ascii="Times New Roman" w:hAnsi="Times New Roman" w:eastAsia="Times New Roman"/>
+          <w:color w:val="000000"/>
+          <w:sz w:val="22"/>
+        </w:rPr>
+        <w:t xml:space="preserve">“</w:t>
+      </w:r>
+      <w:r>
+        <w:rPr>
+          <w:rFonts w:ascii="Times New Roman" w:hAnsi="Times New Roman" w:eastAsia="Times New Roman"/>
+          <w:color w:val="000000"/>
+          <w:sz w:val="22"/>
+        </w:rPr>
+        <w:t xml:space="preserve">AI-generated</w:t>
+      </w:r>
+      <w:r>
+        <w:rPr>
+          <w:rFonts w:ascii="Times New Roman" w:hAnsi="Times New Roman" w:eastAsia="Times New Roman"/>
+          <w:color w:val="000000"/>
+          <w:sz w:val="22"/>
+        </w:rPr>
+        <w:t xml:space="preserve">”</w:t>
+      </w:r>
+      <w:r>
+        <w:rPr>
+          <w:rFonts w:ascii="Times New Roman" w:hAnsi="Times New Roman" w:eastAsia="Times New Roman"/>
+          <w:color w:val="000000"/>
+          <w:sz w:val="22"/>
+        </w:rPr>
+        <w:t xml:space="preserve"> </w:t>
+      </w:r>
+      <w:r>
+        <w:rPr>
+          <w:rFonts w:ascii="Times New Roman" w:hAnsi="Times New Roman" w:eastAsia="Times New Roman"/>
+          <w:color w:val="000000"/>
+          <w:sz w:val="22"/>
+        </w:rPr>
+        <w:t xml:space="preserve">as completely separate trust categories.</w:t>
+      </w:r>
+    </w:p>
+    <w:p>
+      <w:pPr>
+        <w:pStyle w:val="CaptionedFigure"/>
+        <w:keepNext w:val="0"/>
+        <w:spacing w:line="480" w:lineRule="auto" w:before="0" w:after="0"/>
+      </w:pPr>
+      <w:r>
+        <w:rPr>
+          <w:rFonts w:ascii="Times New Roman" w:hAnsi="Times New Roman" w:eastAsia="Times New Roman"/>
+          <w:color w:val="000000"/>
+          <w:sz w:val="22"/>
+        </w:rPr>
+        <w:drawing>
+          <wp:inline>
             <wp:extent cx="5334000" cy="3360080"/>
             <wp:effectExtent b="0" l="0" r="0" t="0"/>
-            <wp:docPr descr="Figure 3. Mean trust rating by visual category." title="" id="1" name="Picture"/>
+            <wp:docPr descr="Figure 4. Mean trust rating by visual category." title="" id="1" name="Picture"/>
             <a:graphic>
               <a:graphicData uri="http://schemas.openxmlformats.org/drawingml/2006/picture">
                 <pic:pic>
@@ -4899,7 +5129,7 @@
                     </pic:cNvPicPr>
                   </pic:nvPicPr>
                   <pic:blipFill>
-                    <a:blip r:embed="rId36"/>
+                    <a:blip r:embed="rId37"/>
                     <a:stretch>
                       <a:fillRect/>
                     </a:stretch>
@@ -4940,11 +5170,11 @@
           <w:color w:val="000000"/>
           <w:sz w:val="22"/>
         </w:rPr>
-        <w:t xml:space="preserve">Figure 3. Mean trust rating by visual category.</w:t>
+        <w:t xml:space="preserve">Figure 4. Mean trust rating by visual category.</w:t>
       </w:r>
     </w:p>
-    <w:bookmarkEnd w:id="37"/>
-    <w:bookmarkStart w:id="39" w:name="material-creation-route-analysis"/>
+    <w:bookmarkEnd w:id="38"/>
+    <w:bookmarkStart w:id="40" w:name="material-creation-route-analysis"/>
     <w:p>
       <w:pPr>
         <w:pStyle w:val="Heading3"/>
@@ -5132,6 +5362,20 @@
           <w:sz w:val="22"/>
         </w:rPr>
         <w:t xml:space="preserve">to identify than AI images generated independently and then paired with similar real images.</w:t>
+      </w:r>
+    </w:p>
+    <w:p>
+      <w:pPr>
+        <w:keepNext w:val="0"/>
+        <w:spacing w:line="480" w:lineRule="auto" w:before="0" w:after="0"/>
+      </w:pPr>
+      <w:r>
+        <w:rPr>
+          <w:rFonts w:ascii="Times New Roman" w:hAnsi="Times New Roman" w:eastAsia="Times New Roman"/>
+          <w:color w:val="000000"/>
+          <w:sz w:val="22"/>
+        </w:rPr>
+        <w:br w:type="page"/>
       </w:r>
     </w:p>
     <w:p>
@@ -5743,7 +5987,7 @@
           <wp:inline>
             <wp:extent cx="5334000" cy="3364366"/>
             <wp:effectExtent b="0" l="0" r="0" t="0"/>
-            <wp:docPr descr="Figure 4. Source-judgement accuracy by material creation route." title="" id="1" name="Picture"/>
+            <wp:docPr descr="Figure 5. Source-judgement accuracy by material creation route." title="" id="1" name="Picture"/>
             <a:graphic>
               <a:graphicData uri="http://schemas.openxmlformats.org/drawingml/2006/picture">
                 <pic:pic>
@@ -5754,7 +5998,7 @@
                     </pic:cNvPicPr>
                   </pic:nvPicPr>
                   <pic:blipFill>
-                    <a:blip r:embed="rId38"/>
+                    <a:blip r:embed="rId39"/>
                     <a:stretch>
                       <a:fillRect/>
                     </a:stretch>
@@ -5795,7 +6039,415 @@
           <w:color w:val="000000"/>
           <w:sz w:val="22"/>
         </w:rPr>
-        <w:t xml:space="preserve">Figure 4. Source-judgement accuracy by material creation route.</w:t>
+        <w:t xml:space="preserve">Figure 5. Source-judgement accuracy by material creation route.</w:t>
+      </w:r>
+    </w:p>
+    <w:bookmarkEnd w:id="40"/>
+    <w:bookmarkStart w:id="42" w:name="media-trust-attitude-items"/>
+    <w:p>
+      <w:pPr>
+        <w:pStyle w:val="Heading3"/>
+        <w:keepNext w:val="0"/>
+        <w:spacing w:line="480" w:lineRule="auto" w:before="0" w:after="0"/>
+      </w:pPr>
+      <w:r>
+        <w:rPr>
+          <w:rFonts w:ascii="Times New Roman" w:hAnsi="Times New Roman" w:eastAsia="Times New Roman"/>
+          <w:color w:val="000000"/>
+          <w:sz w:val="22"/>
+        </w:rPr>
+        <w:t xml:space="preserve">4.5 Media-Trust Attitude Items</w:t>
+      </w:r>
+    </w:p>
+    <w:p>
+      <w:pPr>
+        <w:pStyle w:val="FirstParagraph"/>
+        <w:keepNext w:val="0"/>
+        <w:spacing w:line="480" w:lineRule="auto" w:before="0" w:after="0"/>
+      </w:pPr>
+      <w:r>
+        <w:rPr>
+          <w:rFonts w:ascii="Times New Roman" w:hAnsi="Times New Roman" w:eastAsia="Times New Roman"/>
+          <w:color w:val="000000"/>
+          <w:sz w:val="22"/>
+        </w:rPr>
+        <w:t xml:space="preserve">The attitude items showed a cautious pattern of media trust. Respondents generally did not</w:t>
+      </w:r>
+      <w:r>
+        <w:rPr>
+          <w:rFonts w:ascii="Times New Roman" w:hAnsi="Times New Roman" w:eastAsia="Times New Roman"/>
+          <w:color w:val="000000"/>
+          <w:sz w:val="22"/>
+        </w:rPr>
+        <w:t xml:space="preserve"> </w:t>
+      </w:r>
+      <w:r>
+        <w:rPr>
+          <w:rFonts w:ascii="Times New Roman" w:hAnsi="Times New Roman" w:eastAsia="Times New Roman"/>
+          <w:color w:val="000000"/>
+          <w:sz w:val="22"/>
+        </w:rPr>
+        <w:t xml:space="preserve">agree that online images and screenshots usually reflect reality (M = 2.39). At the same</w:t>
+      </w:r>
+      <w:r>
+        <w:rPr>
+          <w:rFonts w:ascii="Times New Roman" w:hAnsi="Times New Roman" w:eastAsia="Times New Roman"/>
+          <w:color w:val="000000"/>
+          <w:sz w:val="22"/>
+        </w:rPr>
+        <w:t xml:space="preserve"> </w:t>
+      </w:r>
+      <w:r>
+        <w:rPr>
+          <w:rFonts w:ascii="Times New Roman" w:hAnsi="Times New Roman" w:eastAsia="Times New Roman"/>
+          <w:color w:val="000000"/>
+          <w:sz w:val="22"/>
+        </w:rPr>
+        <w:t xml:space="preserve">time, many respondents agreed that platform elements such as interfaces, comments, or</w:t>
+      </w:r>
+      <w:r>
+        <w:rPr>
+          <w:rFonts w:ascii="Times New Roman" w:hAnsi="Times New Roman" w:eastAsia="Times New Roman"/>
+          <w:color w:val="000000"/>
+          <w:sz w:val="22"/>
+        </w:rPr>
+        <w:t xml:space="preserve"> </w:t>
+      </w:r>
+      <w:r>
+        <w:rPr>
+          <w:rFonts w:ascii="Times New Roman" w:hAnsi="Times New Roman" w:eastAsia="Times New Roman"/>
+          <w:color w:val="000000"/>
+          <w:sz w:val="22"/>
+        </w:rPr>
+        <w:t xml:space="preserve">livestream features can make screenshots more believable. Most respondents also reported</w:t>
+      </w:r>
+      <w:r>
+        <w:rPr>
+          <w:rFonts w:ascii="Times New Roman" w:hAnsi="Times New Roman" w:eastAsia="Times New Roman"/>
+          <w:color w:val="000000"/>
+          <w:sz w:val="22"/>
+        </w:rPr>
+        <w:t xml:space="preserve"> </w:t>
+      </w:r>
+      <w:r>
+        <w:rPr>
+          <w:rFonts w:ascii="Times New Roman" w:hAnsi="Times New Roman" w:eastAsia="Times New Roman"/>
+          <w:color w:val="000000"/>
+          <w:sz w:val="22"/>
+        </w:rPr>
+        <w:t xml:space="preserve">verification habits: 42 out of 66 agreed or strongly agreed that they would look for sources</w:t>
+      </w:r>
+      <w:r>
+        <w:rPr>
+          <w:rFonts w:ascii="Times New Roman" w:hAnsi="Times New Roman" w:eastAsia="Times New Roman"/>
+          <w:color w:val="000000"/>
+          <w:sz w:val="22"/>
+        </w:rPr>
+        <w:t xml:space="preserve"> </w:t>
+      </w:r>
+      <w:r>
+        <w:rPr>
+          <w:rFonts w:ascii="Times New Roman" w:hAnsi="Times New Roman" w:eastAsia="Times New Roman"/>
+          <w:color w:val="000000"/>
+          <w:sz w:val="22"/>
+        </w:rPr>
+        <w:t xml:space="preserve">or context when seeing realistic online images or screenshots. However, confidence in</w:t>
+      </w:r>
+      <w:r>
+        <w:rPr>
+          <w:rFonts w:ascii="Times New Roman" w:hAnsi="Times New Roman" w:eastAsia="Times New Roman"/>
+          <w:color w:val="000000"/>
+          <w:sz w:val="22"/>
+        </w:rPr>
+        <w:t xml:space="preserve"> </w:t>
+      </w:r>
+      <w:r>
+        <w:rPr>
+          <w:rFonts w:ascii="Times New Roman" w:hAnsi="Times New Roman" w:eastAsia="Times New Roman"/>
+          <w:color w:val="000000"/>
+          <w:sz w:val="22"/>
+        </w:rPr>
+        <w:t xml:space="preserve">personal judgement remained moderate to low (M = 2.83), with only 17 out of 66 respondents</w:t>
+      </w:r>
+      <w:r>
+        <w:rPr>
+          <w:rFonts w:ascii="Times New Roman" w:hAnsi="Times New Roman" w:eastAsia="Times New Roman"/>
+          <w:color w:val="000000"/>
+          <w:sz w:val="22"/>
+        </w:rPr>
+        <w:t xml:space="preserve"> </w:t>
+      </w:r>
+      <w:r>
+        <w:rPr>
+          <w:rFonts w:ascii="Times New Roman" w:hAnsi="Times New Roman" w:eastAsia="Times New Roman"/>
+          <w:color w:val="000000"/>
+          <w:sz w:val="22"/>
+        </w:rPr>
+        <w:t xml:space="preserve">agreeing or strongly agreeing that they were confident in judging whether online images were</w:t>
+      </w:r>
+      <w:r>
+        <w:rPr>
+          <w:rFonts w:ascii="Times New Roman" w:hAnsi="Times New Roman" w:eastAsia="Times New Roman"/>
+          <w:color w:val="000000"/>
+          <w:sz w:val="22"/>
+        </w:rPr>
+        <w:t xml:space="preserve"> </w:t>
+      </w:r>
+      <w:r>
+        <w:rPr>
+          <w:rFonts w:ascii="Times New Roman" w:hAnsi="Times New Roman" w:eastAsia="Times New Roman"/>
+          <w:color w:val="000000"/>
+          <w:sz w:val="22"/>
+        </w:rPr>
+        <w:t xml:space="preserve">real.</w:t>
+      </w:r>
+    </w:p>
+    <w:p>
+      <w:pPr>
+        <w:pStyle w:val="CaptionedFigure"/>
+        <w:keepNext w:val="0"/>
+        <w:spacing w:line="480" w:lineRule="auto" w:before="0" w:after="0"/>
+      </w:pPr>
+      <w:r>
+        <w:rPr>
+          <w:rFonts w:ascii="Times New Roman" w:hAnsi="Times New Roman" w:eastAsia="Times New Roman"/>
+          <w:color w:val="000000"/>
+          <w:sz w:val="22"/>
+        </w:rPr>
+        <w:drawing>
+          <wp:inline>
+            <wp:extent cx="5334000" cy="2752085"/>
+            <wp:effectExtent b="0" l="0" r="0" t="0"/>
+            <wp:docPr descr="Figure 6. Mean agreement on media-trust attitude items." title="" id="1" name="Picture"/>
+            <a:graphic>
+              <a:graphicData uri="http://schemas.openxmlformats.org/drawingml/2006/picture">
+                <pic:pic>
+                  <pic:nvPicPr>
+                    <pic:cNvPr descr="attitude_item_means.png" id="0" name="Picture"/>
+                    <pic:cNvPicPr>
+                      <a:picLocks noChangeArrowheads="1" noChangeAspect="1"/>
+                    </pic:cNvPicPr>
+                  </pic:nvPicPr>
+                  <pic:blipFill>
+                    <a:blip r:embed="rId41"/>
+                    <a:stretch>
+                      <a:fillRect/>
+                    </a:stretch>
+                  </pic:blipFill>
+                  <pic:spPr bwMode="auto">
+                    <a:xfrm>
+                      <a:off x="0" y="0"/>
+                      <a:ext cx="5334000" cy="2752085"/>
+                    </a:xfrm>
+                    <a:prstGeom prst="rect">
+                      <a:avLst/>
+                    </a:prstGeom>
+                    <a:noFill/>
+                    <a:ln w="9525">
+                      <a:noFill/>
+                      <a:headEnd/>
+                      <a:tailEnd/>
+                    </a:ln>
+                  </pic:spPr>
+                </pic:pic>
+              </a:graphicData>
+            </a:graphic>
+          </wp:inline>
+        </w:drawing>
+      </w:r>
+    </w:p>
+    <w:p>
+      <w:pPr>
+        <w:pStyle w:val="ImageCaption"/>
+        <w:keepNext w:val="0"/>
+        <w:spacing w:line="480" w:lineRule="auto" w:before="0" w:after="0"/>
+        <w:jc w:val="center"/>
+      </w:pPr>
+      <w:r>
+        <w:rPr>
+          <w:rFonts w:ascii="Times New Roman" w:hAnsi="Times New Roman" w:eastAsia="Times New Roman"/>
+          <w:b/>
+          <w:color w:val="000000"/>
+          <w:sz w:val="22"/>
+        </w:rPr>
+        <w:t xml:space="preserve">Figure 6. Mean agreement on media-trust attitude items.</w:t>
+      </w:r>
+    </w:p>
+    <w:bookmarkEnd w:id="42"/>
+    <w:bookmarkEnd w:id="43"/>
+    <w:bookmarkStart w:id="48" w:name="discussion"/>
+    <w:p>
+      <w:pPr>
+        <w:pStyle w:val="Heading2"/>
+        <w:keepNext w:val="0"/>
+        <w:spacing w:line="480" w:lineRule="auto" w:before="0" w:after="0"/>
+      </w:pPr>
+      <w:r>
+        <w:rPr>
+          <w:rFonts w:ascii="Times New Roman" w:hAnsi="Times New Roman" w:eastAsia="Times New Roman"/>
+          <w:color w:val="000000"/>
+          <w:sz w:val="22"/>
+        </w:rPr>
+        <w:t xml:space="preserve">5. Discussion</w:t>
+      </w:r>
+    </w:p>
+    <w:bookmarkStart w:id="44" w:name="summary-of-findings"/>
+    <w:p>
+      <w:pPr>
+        <w:pStyle w:val="Heading3"/>
+        <w:keepNext w:val="0"/>
+        <w:spacing w:line="480" w:lineRule="auto" w:before="0" w:after="0"/>
+      </w:pPr>
+      <w:r>
+        <w:rPr>
+          <w:rFonts w:ascii="Times New Roman" w:hAnsi="Times New Roman" w:eastAsia="Times New Roman"/>
+          <w:color w:val="000000"/>
+          <w:sz w:val="22"/>
+        </w:rPr>
+        <w:t xml:space="preserve">5.1 Summary of Findings</w:t>
+      </w:r>
+    </w:p>
+    <w:p>
+      <w:pPr>
+        <w:pStyle w:val="FirstParagraph"/>
+        <w:keepNext w:val="0"/>
+        <w:spacing w:line="480" w:lineRule="auto" w:before="0" w:after="0"/>
+      </w:pPr>
+      <w:r>
+        <w:rPr>
+          <w:rFonts w:ascii="Times New Roman" w:hAnsi="Times New Roman" w:eastAsia="Times New Roman"/>
+          <w:color w:val="000000"/>
+          <w:sz w:val="22"/>
+        </w:rPr>
+        <w:t xml:space="preserve">The local survey results are consistent with the broader literature on AI-generated media</w:t>
+      </w:r>
+      <w:r>
+        <w:rPr>
+          <w:rFonts w:ascii="Times New Roman" w:hAnsi="Times New Roman" w:eastAsia="Times New Roman"/>
+          <w:color w:val="000000"/>
+          <w:sz w:val="22"/>
+        </w:rPr>
+        <w:t xml:space="preserve"> </w:t>
+      </w:r>
+      <w:r>
+        <w:rPr>
+          <w:rFonts w:ascii="Times New Roman" w:hAnsi="Times New Roman" w:eastAsia="Times New Roman"/>
+          <w:color w:val="000000"/>
+          <w:sz w:val="22"/>
+        </w:rPr>
+        <w:t xml:space="preserve">detection, but they also show a more specific pattern: source judgement was unstable. The</w:t>
+      </w:r>
+      <w:r>
+        <w:rPr>
+          <w:rFonts w:ascii="Times New Roman" w:hAnsi="Times New Roman" w:eastAsia="Times New Roman"/>
+          <w:color w:val="000000"/>
+          <w:sz w:val="22"/>
+        </w:rPr>
+        <w:t xml:space="preserve"> </w:t>
+      </w:r>
+      <w:r>
+        <w:rPr>
+          <w:rFonts w:ascii="Times New Roman" w:hAnsi="Times New Roman" w:eastAsia="Times New Roman"/>
+          <w:color w:val="000000"/>
+          <w:sz w:val="22"/>
+        </w:rPr>
+        <w:t xml:space="preserve">overall accuracy rate was below 50%, suggesting that respondents in this sample had</w:t>
+      </w:r>
+      <w:r>
+        <w:rPr>
+          <w:rFonts w:ascii="Times New Roman" w:hAnsi="Times New Roman" w:eastAsia="Times New Roman"/>
+          <w:color w:val="000000"/>
+          <w:sz w:val="22"/>
+        </w:rPr>
+        <w:t xml:space="preserve"> </w:t>
+      </w:r>
+      <w:r>
+        <w:rPr>
+          <w:rFonts w:ascii="Times New Roman" w:hAnsi="Times New Roman" w:eastAsia="Times New Roman"/>
+          <w:color w:val="000000"/>
+          <w:sz w:val="22"/>
+        </w:rPr>
+        <w:t xml:space="preserve">difficulty distinguishing AI-generated images from real images. The source-level pattern is</w:t>
+      </w:r>
+      <w:r>
+        <w:rPr>
+          <w:rFonts w:ascii="Times New Roman" w:hAnsi="Times New Roman" w:eastAsia="Times New Roman"/>
+          <w:color w:val="000000"/>
+          <w:sz w:val="22"/>
+        </w:rPr>
+        <w:t xml:space="preserve"> </w:t>
+      </w:r>
+      <w:r>
+        <w:rPr>
+          <w:rFonts w:ascii="Times New Roman" w:hAnsi="Times New Roman" w:eastAsia="Times New Roman"/>
+          <w:color w:val="000000"/>
+          <w:sz w:val="22"/>
+        </w:rPr>
+        <w:t xml:space="preserve">also important: respondents performed better on AI-generated images than on real images. This</w:t>
+      </w:r>
+      <w:r>
+        <w:rPr>
+          <w:rFonts w:ascii="Times New Roman" w:hAnsi="Times New Roman" w:eastAsia="Times New Roman"/>
+          <w:color w:val="000000"/>
+          <w:sz w:val="22"/>
+        </w:rPr>
+        <w:t xml:space="preserve"> </w:t>
+      </w:r>
+      <w:r>
+        <w:rPr>
+          <w:rFonts w:ascii="Times New Roman" w:hAnsi="Times New Roman" w:eastAsia="Times New Roman"/>
+          <w:color w:val="000000"/>
+          <w:sz w:val="22"/>
+        </w:rPr>
+        <w:t xml:space="preserve">indicates that the problem was not only false acceptance of synthetic material, but also</w:t>
+      </w:r>
+      <w:r>
+        <w:rPr>
+          <w:rFonts w:ascii="Times New Roman" w:hAnsi="Times New Roman" w:eastAsia="Times New Roman"/>
+          <w:color w:val="000000"/>
+          <w:sz w:val="22"/>
+        </w:rPr>
+        <w:t xml:space="preserve"> </w:t>
+      </w:r>
+      <w:r>
+        <w:rPr>
+          <w:rFonts w:ascii="Times New Roman" w:hAnsi="Times New Roman" w:eastAsia="Times New Roman"/>
+          <w:color w:val="000000"/>
+          <w:sz w:val="22"/>
+        </w:rPr>
+        <w:t xml:space="preserve">excessive suspicion toward authentic visual material. In other words, AI-generated visual</w:t>
+      </w:r>
+      <w:r>
+        <w:rPr>
+          <w:rFonts w:ascii="Times New Roman" w:hAnsi="Times New Roman" w:eastAsia="Times New Roman"/>
+          <w:color w:val="000000"/>
+          <w:sz w:val="22"/>
+        </w:rPr>
+        <w:t xml:space="preserve"> </w:t>
+      </w:r>
+      <w:r>
+        <w:rPr>
+          <w:rFonts w:ascii="Times New Roman" w:hAnsi="Times New Roman" w:eastAsia="Times New Roman"/>
+          <w:color w:val="000000"/>
+          <w:sz w:val="22"/>
+        </w:rPr>
+        <w:t xml:space="preserve">content may damage media trust in two directions. It can make false visual evidence more</w:t>
+      </w:r>
+      <w:r>
+        <w:rPr>
+          <w:rFonts w:ascii="Times New Roman" w:hAnsi="Times New Roman" w:eastAsia="Times New Roman"/>
+          <w:color w:val="000000"/>
+          <w:sz w:val="22"/>
+        </w:rPr>
+        <w:t xml:space="preserve"> </w:t>
+      </w:r>
+      <w:r>
+        <w:rPr>
+          <w:rFonts w:ascii="Times New Roman" w:hAnsi="Times New Roman" w:eastAsia="Times New Roman"/>
+          <w:color w:val="000000"/>
+          <w:sz w:val="22"/>
+        </w:rPr>
+        <w:t xml:space="preserve">credible, and it can make real visual evidence easier to doubt.</w:t>
       </w:r>
     </w:p>
     <w:p>
@@ -5810,95 +6462,108 @@
           <w:color w:val="000000"/>
           <w:sz w:val="22"/>
         </w:rPr>
-        <w:t xml:space="preserve">The attitude items showed a cautious pattern of media trust. Respondents generally did not</w:t>
-      </w:r>
-      <w:r>
-        <w:rPr>
-          <w:rFonts w:ascii="Times New Roman" w:hAnsi="Times New Roman" w:eastAsia="Times New Roman"/>
-          <w:color w:val="000000"/>
-          <w:sz w:val="22"/>
-        </w:rPr>
-        <w:t xml:space="preserve"> </w:t>
-      </w:r>
-      <w:r>
-        <w:rPr>
-          <w:rFonts w:ascii="Times New Roman" w:hAnsi="Times New Roman" w:eastAsia="Times New Roman"/>
-          <w:color w:val="000000"/>
-          <w:sz w:val="22"/>
-        </w:rPr>
-        <w:t xml:space="preserve">agree that online images and screenshots usually reflect reality (M = 2.39). At the same</w:t>
-      </w:r>
-      <w:r>
-        <w:rPr>
-          <w:rFonts w:ascii="Times New Roman" w:hAnsi="Times New Roman" w:eastAsia="Times New Roman"/>
-          <w:color w:val="000000"/>
-          <w:sz w:val="22"/>
-        </w:rPr>
-        <w:t xml:space="preserve"> </w:t>
-      </w:r>
-      <w:r>
-        <w:rPr>
-          <w:rFonts w:ascii="Times New Roman" w:hAnsi="Times New Roman" w:eastAsia="Times New Roman"/>
-          <w:color w:val="000000"/>
-          <w:sz w:val="22"/>
-        </w:rPr>
-        <w:t xml:space="preserve">time, many respondents agreed that platform elements such as interfaces, comments, or</w:t>
-      </w:r>
-      <w:r>
-        <w:rPr>
-          <w:rFonts w:ascii="Times New Roman" w:hAnsi="Times New Roman" w:eastAsia="Times New Roman"/>
-          <w:color w:val="000000"/>
-          <w:sz w:val="22"/>
-        </w:rPr>
-        <w:t xml:space="preserve"> </w:t>
-      </w:r>
-      <w:r>
-        <w:rPr>
-          <w:rFonts w:ascii="Times New Roman" w:hAnsi="Times New Roman" w:eastAsia="Times New Roman"/>
-          <w:color w:val="000000"/>
-          <w:sz w:val="22"/>
-        </w:rPr>
-        <w:t xml:space="preserve">livestream features can make screenshots more believable. Most respondents also reported</w:t>
-      </w:r>
-      <w:r>
-        <w:rPr>
-          <w:rFonts w:ascii="Times New Roman" w:hAnsi="Times New Roman" w:eastAsia="Times New Roman"/>
-          <w:color w:val="000000"/>
-          <w:sz w:val="22"/>
-        </w:rPr>
-        <w:t xml:space="preserve"> </w:t>
-      </w:r>
-      <w:r>
-        <w:rPr>
-          <w:rFonts w:ascii="Times New Roman" w:hAnsi="Times New Roman" w:eastAsia="Times New Roman"/>
-          <w:color w:val="000000"/>
-          <w:sz w:val="22"/>
-        </w:rPr>
-        <w:t xml:space="preserve">verification habits: 42 out of 66 agreed or strongly agreed that they would look for sources</w:t>
-      </w:r>
-      <w:r>
-        <w:rPr>
-          <w:rFonts w:ascii="Times New Roman" w:hAnsi="Times New Roman" w:eastAsia="Times New Roman"/>
-          <w:color w:val="000000"/>
-          <w:sz w:val="22"/>
-        </w:rPr>
-        <w:t xml:space="preserve"> </w:t>
-      </w:r>
-      <w:r>
-        <w:rPr>
-          <w:rFonts w:ascii="Times New Roman" w:hAnsi="Times New Roman" w:eastAsia="Times New Roman"/>
-          <w:color w:val="000000"/>
-          <w:sz w:val="22"/>
-        </w:rPr>
-        <w:t xml:space="preserve">or context when seeing realistic online images or screenshots.</w:t>
+        <w:t xml:space="preserve">Category-level results further support this interpretation. Livestream commerce screenshots,</w:t>
+      </w:r>
+      <w:r>
+        <w:rPr>
+          <w:rFonts w:ascii="Times New Roman" w:hAnsi="Times New Roman" w:eastAsia="Times New Roman"/>
+          <w:color w:val="000000"/>
+          <w:sz w:val="22"/>
+        </w:rPr>
+        <w:t xml:space="preserve"> </w:t>
+      </w:r>
+      <w:r>
+        <w:rPr>
+          <w:rFonts w:ascii="Times New Roman" w:hAnsi="Times New Roman" w:eastAsia="Times New Roman"/>
+          <w:color w:val="000000"/>
+          <w:sz w:val="22"/>
+        </w:rPr>
+        <w:t xml:space="preserve">text-bearing artifacts, and virtual livestream interfaces produced higher accuracy than</w:t>
+      </w:r>
+      <w:r>
+        <w:rPr>
+          <w:rFonts w:ascii="Times New Roman" w:hAnsi="Times New Roman" w:eastAsia="Times New Roman"/>
+          <w:color w:val="000000"/>
+          <w:sz w:val="22"/>
+        </w:rPr>
+        <w:t xml:space="preserve"> </w:t>
+      </w:r>
+      <w:r>
+        <w:rPr>
+          <w:rFonts w:ascii="Times New Roman" w:hAnsi="Times New Roman" w:eastAsia="Times New Roman"/>
+          <w:color w:val="000000"/>
+          <w:sz w:val="22"/>
+        </w:rPr>
+        <w:t xml:space="preserve">portraits and food photographs. Food photographs had the lowest accuracy, which may reflect</w:t>
+      </w:r>
+      <w:r>
+        <w:rPr>
+          <w:rFonts w:ascii="Times New Roman" w:hAnsi="Times New Roman" w:eastAsia="Times New Roman"/>
+          <w:color w:val="000000"/>
+          <w:sz w:val="22"/>
+        </w:rPr>
+        <w:t xml:space="preserve"> </w:t>
+      </w:r>
+      <w:r>
+        <w:rPr>
+          <w:rFonts w:ascii="Times New Roman" w:hAnsi="Times New Roman" w:eastAsia="Times New Roman"/>
+          <w:color w:val="000000"/>
+          <w:sz w:val="22"/>
+        </w:rPr>
+        <w:t xml:space="preserve">the fact that polished food photography can look artificial even when it is real. Trust</w:t>
+      </w:r>
+      <w:r>
+        <w:rPr>
+          <w:rFonts w:ascii="Times New Roman" w:hAnsi="Times New Roman" w:eastAsia="Times New Roman"/>
+          <w:color w:val="000000"/>
+          <w:sz w:val="22"/>
+        </w:rPr>
+        <w:t xml:space="preserve"> </w:t>
+      </w:r>
+      <w:r>
+        <w:rPr>
+          <w:rFonts w:ascii="Times New Roman" w:hAnsi="Times New Roman" w:eastAsia="Times New Roman"/>
+          <w:color w:val="000000"/>
+          <w:sz w:val="22"/>
+        </w:rPr>
+        <w:t xml:space="preserve">ratings were moderate rather than high, and the difference between real and AI-generated</w:t>
+      </w:r>
+      <w:r>
+        <w:rPr>
+          <w:rFonts w:ascii="Times New Roman" w:hAnsi="Times New Roman" w:eastAsia="Times New Roman"/>
+          <w:color w:val="000000"/>
+          <w:sz w:val="22"/>
+        </w:rPr>
+        <w:t xml:space="preserve"> </w:t>
+      </w:r>
+      <w:r>
+        <w:rPr>
+          <w:rFonts w:ascii="Times New Roman" w:hAnsi="Times New Roman" w:eastAsia="Times New Roman"/>
+          <w:color w:val="000000"/>
+          <w:sz w:val="22"/>
+        </w:rPr>
+        <w:t xml:space="preserve">images was relatively small. This suggests that viewers may experience uncertainty even when</w:t>
+      </w:r>
+      <w:r>
+        <w:rPr>
+          <w:rFonts w:ascii="Times New Roman" w:hAnsi="Times New Roman" w:eastAsia="Times New Roman"/>
+          <w:color w:val="000000"/>
+          <w:sz w:val="22"/>
+        </w:rPr>
+        <w:t xml:space="preserve"> </w:t>
+      </w:r>
+      <w:r>
+        <w:rPr>
+          <w:rFonts w:ascii="Times New Roman" w:hAnsi="Times New Roman" w:eastAsia="Times New Roman"/>
+          <w:color w:val="000000"/>
+          <w:sz w:val="22"/>
+        </w:rPr>
+        <w:t xml:space="preserve">they do not strongly trust the images.</w:t>
       </w:r>
     </w:p>
-    <w:bookmarkEnd w:id="39"/>
-    <w:bookmarkEnd w:id="40"/>
-    <w:bookmarkStart w:id="45" w:name="discussion"/>
     <w:p>
       <w:pPr>
-        <w:pStyle w:val="Heading2"/>
+        <w:pStyle w:val="BodyText"/>
         <w:keepNext w:val="0"/>
         <w:spacing w:line="480" w:lineRule="auto" w:before="0" w:after="0"/>
       </w:pPr>
@@ -5908,10 +6573,91 @@
           <w:color w:val="000000"/>
           <w:sz w:val="22"/>
         </w:rPr>
-        <w:t xml:space="preserve">5. Discussion</w:t>
+        <w:t xml:space="preserve">The material creation route analysis adds a further qualification. AI images created through</w:t>
+      </w:r>
+      <w:r>
+        <w:rPr>
+          <w:rFonts w:ascii="Times New Roman" w:hAnsi="Times New Roman" w:eastAsia="Times New Roman"/>
+          <w:color w:val="000000"/>
+          <w:sz w:val="22"/>
+        </w:rPr>
+        <w:t xml:space="preserve"> </w:t>
+      </w:r>
+      <w:r>
+        <w:rPr>
+          <w:rFonts w:ascii="Times New Roman" w:hAnsi="Times New Roman" w:eastAsia="Times New Roman"/>
+          <w:color w:val="000000"/>
+          <w:sz w:val="22"/>
+        </w:rPr>
+        <w:t xml:space="preserve">real-to-AI modification were less accurately identified than AI images in the AI-first</w:t>
+      </w:r>
+      <w:r>
+        <w:rPr>
+          <w:rFonts w:ascii="Times New Roman" w:hAnsi="Times New Roman" w:eastAsia="Times New Roman"/>
+          <w:color w:val="000000"/>
+          <w:sz w:val="22"/>
+        </w:rPr>
+        <w:t xml:space="preserve"> </w:t>
+      </w:r>
+      <w:r>
+        <w:rPr>
+          <w:rFonts w:ascii="Times New Roman" w:hAnsi="Times New Roman" w:eastAsia="Times New Roman"/>
+          <w:color w:val="000000"/>
+          <w:sz w:val="22"/>
+        </w:rPr>
+        <w:t xml:space="preserve">matched-real route. They also received higher trust ratings. This suggests that when AI</w:t>
+      </w:r>
+      <w:r>
+        <w:rPr>
+          <w:rFonts w:ascii="Times New Roman" w:hAnsi="Times New Roman" w:eastAsia="Times New Roman"/>
+          <w:color w:val="000000"/>
+          <w:sz w:val="22"/>
+        </w:rPr>
+        <w:t xml:space="preserve"> </w:t>
+      </w:r>
+      <w:r>
+        <w:rPr>
+          <w:rFonts w:ascii="Times New Roman" w:hAnsi="Times New Roman" w:eastAsia="Times New Roman"/>
+          <w:color w:val="000000"/>
+          <w:sz w:val="22"/>
+        </w:rPr>
+        <w:t xml:space="preserve">generation preserves the composition, subject matter, or visual realism of a real reference,</w:t>
+      </w:r>
+      <w:r>
+        <w:rPr>
+          <w:rFonts w:ascii="Times New Roman" w:hAnsi="Times New Roman" w:eastAsia="Times New Roman"/>
+          <w:color w:val="000000"/>
+          <w:sz w:val="22"/>
+        </w:rPr>
+        <w:t xml:space="preserve"> </w:t>
+      </w:r>
+      <w:r>
+        <w:rPr>
+          <w:rFonts w:ascii="Times New Roman" w:hAnsi="Times New Roman" w:eastAsia="Times New Roman"/>
+          <w:color w:val="000000"/>
+          <w:sz w:val="22"/>
+        </w:rPr>
+        <w:t xml:space="preserve">the resulting synthetic image may be more difficult to separate from authentic visual</w:t>
+      </w:r>
+      <w:r>
+        <w:rPr>
+          <w:rFonts w:ascii="Times New Roman" w:hAnsi="Times New Roman" w:eastAsia="Times New Roman"/>
+          <w:color w:val="000000"/>
+          <w:sz w:val="22"/>
+        </w:rPr>
+        <w:t xml:space="preserve"> </w:t>
+      </w:r>
+      <w:r>
+        <w:rPr>
+          <w:rFonts w:ascii="Times New Roman" w:hAnsi="Times New Roman" w:eastAsia="Times New Roman"/>
+          <w:color w:val="000000"/>
+          <w:sz w:val="22"/>
+        </w:rPr>
+        <w:t xml:space="preserve">material.</w:t>
       </w:r>
     </w:p>
-    <w:bookmarkStart w:id="41" w:name="summary-of-findings"/>
+    <w:bookmarkEnd w:id="44"/>
+    <w:bookmarkStart w:id="45" w:name="comparison-with-previous-studies"/>
     <w:p>
       <w:pPr>
         <w:pStyle w:val="Heading3"/>
@@ -5924,7 +6670,7 @@
           <w:color w:val="000000"/>
           <w:sz w:val="22"/>
         </w:rPr>
-        <w:t xml:space="preserve">5.1 Summary of Findings</w:t>
+        <w:t xml:space="preserve">5.2 Comparison with Previous Studies</w:t>
       </w:r>
     </w:p>
     <w:p>
@@ -5939,135 +6685,87 @@
           <w:color w:val="000000"/>
           <w:sz w:val="22"/>
         </w:rPr>
-        <w:t xml:space="preserve">The local survey results are consistent with the broader literature on AI-generated media</w:t>
-      </w:r>
-      <w:r>
-        <w:rPr>
-          <w:rFonts w:ascii="Times New Roman" w:hAnsi="Times New Roman" w:eastAsia="Times New Roman"/>
-          <w:color w:val="000000"/>
-          <w:sz w:val="22"/>
-        </w:rPr>
-        <w:t xml:space="preserve"> </w:t>
-      </w:r>
-      <w:r>
-        <w:rPr>
-          <w:rFonts w:ascii="Times New Roman" w:hAnsi="Times New Roman" w:eastAsia="Times New Roman"/>
-          <w:color w:val="000000"/>
-          <w:sz w:val="22"/>
-        </w:rPr>
-        <w:t xml:space="preserve">detection, but they also show a more specific pattern: source judgement was unstable. The</w:t>
-      </w:r>
-      <w:r>
-        <w:rPr>
-          <w:rFonts w:ascii="Times New Roman" w:hAnsi="Times New Roman" w:eastAsia="Times New Roman"/>
-          <w:color w:val="000000"/>
-          <w:sz w:val="22"/>
-        </w:rPr>
-        <w:t xml:space="preserve"> </w:t>
-      </w:r>
-      <w:r>
-        <w:rPr>
-          <w:rFonts w:ascii="Times New Roman" w:hAnsi="Times New Roman" w:eastAsia="Times New Roman"/>
-          <w:color w:val="000000"/>
-          <w:sz w:val="22"/>
-        </w:rPr>
-        <w:t xml:space="preserve">overall accuracy rate was below 50%, suggesting that respondents in this sample had</w:t>
-      </w:r>
-      <w:r>
-        <w:rPr>
-          <w:rFonts w:ascii="Times New Roman" w:hAnsi="Times New Roman" w:eastAsia="Times New Roman"/>
-          <w:color w:val="000000"/>
-          <w:sz w:val="22"/>
-        </w:rPr>
-        <w:t xml:space="preserve"> </w:t>
-      </w:r>
-      <w:r>
-        <w:rPr>
-          <w:rFonts w:ascii="Times New Roman" w:hAnsi="Times New Roman" w:eastAsia="Times New Roman"/>
-          <w:color w:val="000000"/>
-          <w:sz w:val="22"/>
-        </w:rPr>
-        <w:t xml:space="preserve">difficulty distinguishing AI-generated images from real images. The source-level pattern is</w:t>
-      </w:r>
-      <w:r>
-        <w:rPr>
-          <w:rFonts w:ascii="Times New Roman" w:hAnsi="Times New Roman" w:eastAsia="Times New Roman"/>
-          <w:color w:val="000000"/>
-          <w:sz w:val="22"/>
-        </w:rPr>
-        <w:t xml:space="preserve"> </w:t>
-      </w:r>
-      <w:r>
-        <w:rPr>
-          <w:rFonts w:ascii="Times New Roman" w:hAnsi="Times New Roman" w:eastAsia="Times New Roman"/>
-          <w:color w:val="000000"/>
-          <w:sz w:val="22"/>
-        </w:rPr>
-        <w:t xml:space="preserve">also important: respondents performed better on AI-generated images than on real images. This</w:t>
-      </w:r>
-      <w:r>
-        <w:rPr>
-          <w:rFonts w:ascii="Times New Roman" w:hAnsi="Times New Roman" w:eastAsia="Times New Roman"/>
-          <w:color w:val="000000"/>
-          <w:sz w:val="22"/>
-        </w:rPr>
-        <w:t xml:space="preserve"> </w:t>
-      </w:r>
-      <w:r>
-        <w:rPr>
-          <w:rFonts w:ascii="Times New Roman" w:hAnsi="Times New Roman" w:eastAsia="Times New Roman"/>
-          <w:color w:val="000000"/>
-          <w:sz w:val="22"/>
-        </w:rPr>
-        <w:t xml:space="preserve">indicates that the problem was not only false acceptance of synthetic material, but also</w:t>
-      </w:r>
-      <w:r>
-        <w:rPr>
-          <w:rFonts w:ascii="Times New Roman" w:hAnsi="Times New Roman" w:eastAsia="Times New Roman"/>
-          <w:color w:val="000000"/>
-          <w:sz w:val="22"/>
-        </w:rPr>
-        <w:t xml:space="preserve"> </w:t>
-      </w:r>
-      <w:r>
-        <w:rPr>
-          <w:rFonts w:ascii="Times New Roman" w:hAnsi="Times New Roman" w:eastAsia="Times New Roman"/>
-          <w:color w:val="000000"/>
-          <w:sz w:val="22"/>
-        </w:rPr>
-        <w:t xml:space="preserve">excessive suspicion toward authentic visual material. In other words, AI-generated visual</w:t>
-      </w:r>
-      <w:r>
-        <w:rPr>
-          <w:rFonts w:ascii="Times New Roman" w:hAnsi="Times New Roman" w:eastAsia="Times New Roman"/>
-          <w:color w:val="000000"/>
-          <w:sz w:val="22"/>
-        </w:rPr>
-        <w:t xml:space="preserve"> </w:t>
-      </w:r>
-      <w:r>
-        <w:rPr>
-          <w:rFonts w:ascii="Times New Roman" w:hAnsi="Times New Roman" w:eastAsia="Times New Roman"/>
-          <w:color w:val="000000"/>
-          <w:sz w:val="22"/>
-        </w:rPr>
-        <w:t xml:space="preserve">content may damage media trust in two directions. It can make false visual evidence more</w:t>
-      </w:r>
-      <w:r>
-        <w:rPr>
-          <w:rFonts w:ascii="Times New Roman" w:hAnsi="Times New Roman" w:eastAsia="Times New Roman"/>
-          <w:color w:val="000000"/>
-          <w:sz w:val="22"/>
-        </w:rPr>
-        <w:t xml:space="preserve"> </w:t>
-      </w:r>
-      <w:r>
-        <w:rPr>
-          <w:rFonts w:ascii="Times New Roman" w:hAnsi="Times New Roman" w:eastAsia="Times New Roman"/>
-          <w:color w:val="000000"/>
-          <w:sz w:val="22"/>
-        </w:rPr>
-        <w:t xml:space="preserve">credible, and it can make real visual evidence easier to doubt.</w:t>
+        <w:t xml:space="preserve">The findings align with previous studies showing that human detection of AI-generated media</w:t>
+      </w:r>
+      <w:r>
+        <w:rPr>
+          <w:rFonts w:ascii="Times New Roman" w:hAnsi="Times New Roman" w:eastAsia="Times New Roman"/>
+          <w:color w:val="000000"/>
+          <w:sz w:val="22"/>
+        </w:rPr>
+        <w:t xml:space="preserve"> </w:t>
+      </w:r>
+      <w:r>
+        <w:rPr>
+          <w:rFonts w:ascii="Times New Roman" w:hAnsi="Times New Roman" w:eastAsia="Times New Roman"/>
+          <w:color w:val="000000"/>
+          <w:sz w:val="22"/>
+        </w:rPr>
+        <w:t xml:space="preserve">is limited. Frank et al. (2024) found that many participants performed close to chance level</w:t>
+      </w:r>
+      <w:r>
+        <w:rPr>
+          <w:rFonts w:ascii="Times New Roman" w:hAnsi="Times New Roman" w:eastAsia="Times New Roman"/>
+          <w:color w:val="000000"/>
+          <w:sz w:val="22"/>
+        </w:rPr>
+        <w:t xml:space="preserve"> </w:t>
+      </w:r>
+      <w:r>
+        <w:rPr>
+          <w:rFonts w:ascii="Times New Roman" w:hAnsi="Times New Roman" w:eastAsia="Times New Roman"/>
+          <w:color w:val="000000"/>
+          <w:sz w:val="22"/>
+        </w:rPr>
+        <w:t xml:space="preserve">across different media types. Roca et al. (2025) also showed that image detection performance</w:t>
+      </w:r>
+      <w:r>
+        <w:rPr>
+          <w:rFonts w:ascii="Times New Roman" w:hAnsi="Times New Roman" w:eastAsia="Times New Roman"/>
+          <w:color w:val="000000"/>
+          <w:sz w:val="22"/>
+        </w:rPr>
+        <w:t xml:space="preserve"> </w:t>
+      </w:r>
+      <w:r>
+        <w:rPr>
+          <w:rFonts w:ascii="Times New Roman" w:hAnsi="Times New Roman" w:eastAsia="Times New Roman"/>
+          <w:color w:val="000000"/>
+          <w:sz w:val="22"/>
+        </w:rPr>
+        <w:t xml:space="preserve">varied by content type. The current survey is much smaller, but its descriptive results point</w:t>
+      </w:r>
+      <w:r>
+        <w:rPr>
+          <w:rFonts w:ascii="Times New Roman" w:hAnsi="Times New Roman" w:eastAsia="Times New Roman"/>
+          <w:color w:val="000000"/>
+          <w:sz w:val="22"/>
+        </w:rPr>
+        <w:t xml:space="preserve"> </w:t>
+      </w:r>
+      <w:r>
+        <w:rPr>
+          <w:rFonts w:ascii="Times New Roman" w:hAnsi="Times New Roman" w:eastAsia="Times New Roman"/>
+          <w:color w:val="000000"/>
+          <w:sz w:val="22"/>
+        </w:rPr>
+        <w:t xml:space="preserve">in the same direction: general familiarity with AI tools does not automatically produce</w:t>
+      </w:r>
+      <w:r>
+        <w:rPr>
+          <w:rFonts w:ascii="Times New Roman" w:hAnsi="Times New Roman" w:eastAsia="Times New Roman"/>
+          <w:color w:val="000000"/>
+          <w:sz w:val="22"/>
+        </w:rPr>
+        <w:t xml:space="preserve"> </w:t>
+      </w:r>
+      <w:r>
+        <w:rPr>
+          <w:rFonts w:ascii="Times New Roman" w:hAnsi="Times New Roman" w:eastAsia="Times New Roman"/>
+          <w:color w:val="000000"/>
+          <w:sz w:val="22"/>
+        </w:rPr>
+        <w:t xml:space="preserve">reliable detection ability.</w:t>
       </w:r>
     </w:p>
     <w:p>
@@ -6082,103 +6780,87 @@
           <w:color w:val="000000"/>
           <w:sz w:val="22"/>
         </w:rPr>
-        <w:t xml:space="preserve">Category-level results further support this interpretation. Livestream commerce screenshots,</w:t>
-      </w:r>
-      <w:r>
-        <w:rPr>
-          <w:rFonts w:ascii="Times New Roman" w:hAnsi="Times New Roman" w:eastAsia="Times New Roman"/>
-          <w:color w:val="000000"/>
-          <w:sz w:val="22"/>
-        </w:rPr>
-        <w:t xml:space="preserve"> </w:t>
-      </w:r>
-      <w:r>
-        <w:rPr>
-          <w:rFonts w:ascii="Times New Roman" w:hAnsi="Times New Roman" w:eastAsia="Times New Roman"/>
-          <w:color w:val="000000"/>
-          <w:sz w:val="22"/>
-        </w:rPr>
-        <w:t xml:space="preserve">text-bearing artifacts, and virtual livestream interfaces produced higher accuracy than</w:t>
-      </w:r>
-      <w:r>
-        <w:rPr>
-          <w:rFonts w:ascii="Times New Roman" w:hAnsi="Times New Roman" w:eastAsia="Times New Roman"/>
-          <w:color w:val="000000"/>
-          <w:sz w:val="22"/>
-        </w:rPr>
-        <w:t xml:space="preserve"> </w:t>
-      </w:r>
-      <w:r>
-        <w:rPr>
-          <w:rFonts w:ascii="Times New Roman" w:hAnsi="Times New Roman" w:eastAsia="Times New Roman"/>
-          <w:color w:val="000000"/>
-          <w:sz w:val="22"/>
-        </w:rPr>
-        <w:t xml:space="preserve">portraits and food photographs. Food photographs had the lowest accuracy, which may reflect</w:t>
-      </w:r>
-      <w:r>
-        <w:rPr>
-          <w:rFonts w:ascii="Times New Roman" w:hAnsi="Times New Roman" w:eastAsia="Times New Roman"/>
-          <w:color w:val="000000"/>
-          <w:sz w:val="22"/>
-        </w:rPr>
-        <w:t xml:space="preserve"> </w:t>
-      </w:r>
-      <w:r>
-        <w:rPr>
-          <w:rFonts w:ascii="Times New Roman" w:hAnsi="Times New Roman" w:eastAsia="Times New Roman"/>
-          <w:color w:val="000000"/>
-          <w:sz w:val="22"/>
-        </w:rPr>
-        <w:t xml:space="preserve">the fact that polished food photography can look artificial even when it is real. Trust</w:t>
-      </w:r>
-      <w:r>
-        <w:rPr>
-          <w:rFonts w:ascii="Times New Roman" w:hAnsi="Times New Roman" w:eastAsia="Times New Roman"/>
-          <w:color w:val="000000"/>
-          <w:sz w:val="22"/>
-        </w:rPr>
-        <w:t xml:space="preserve"> </w:t>
-      </w:r>
-      <w:r>
-        <w:rPr>
-          <w:rFonts w:ascii="Times New Roman" w:hAnsi="Times New Roman" w:eastAsia="Times New Roman"/>
-          <w:color w:val="000000"/>
-          <w:sz w:val="22"/>
-        </w:rPr>
-        <w:t xml:space="preserve">ratings were moderate rather than high, and the difference between real and AI-generated</w:t>
-      </w:r>
-      <w:r>
-        <w:rPr>
-          <w:rFonts w:ascii="Times New Roman" w:hAnsi="Times New Roman" w:eastAsia="Times New Roman"/>
-          <w:color w:val="000000"/>
-          <w:sz w:val="22"/>
-        </w:rPr>
-        <w:t xml:space="preserve"> </w:t>
-      </w:r>
-      <w:r>
-        <w:rPr>
-          <w:rFonts w:ascii="Times New Roman" w:hAnsi="Times New Roman" w:eastAsia="Times New Roman"/>
-          <w:color w:val="000000"/>
-          <w:sz w:val="22"/>
-        </w:rPr>
-        <w:t xml:space="preserve">images was relatively small. This suggests that viewers may experience uncertainty even when</w:t>
-      </w:r>
-      <w:r>
-        <w:rPr>
-          <w:rFonts w:ascii="Times New Roman" w:hAnsi="Times New Roman" w:eastAsia="Times New Roman"/>
-          <w:color w:val="000000"/>
-          <w:sz w:val="22"/>
-        </w:rPr>
-        <w:t xml:space="preserve"> </w:t>
-      </w:r>
-      <w:r>
-        <w:rPr>
-          <w:rFonts w:ascii="Times New Roman" w:hAnsi="Times New Roman" w:eastAsia="Times New Roman"/>
-          <w:color w:val="000000"/>
-          <w:sz w:val="22"/>
-        </w:rPr>
-        <w:t xml:space="preserve">they do not strongly trust the images.</w:t>
+        <w:t xml:space="preserve">The results also connect with research on misinformation and visual evidence. Guo et al.</w:t>
+      </w:r>
+      <w:r>
+        <w:rPr>
+          <w:rFonts w:ascii="Times New Roman" w:hAnsi="Times New Roman" w:eastAsia="Times New Roman"/>
+          <w:color w:val="000000"/>
+          <w:sz w:val="22"/>
+        </w:rPr>
+        <w:t xml:space="preserve"> </w:t>
+      </w:r>
+      <w:r>
+        <w:rPr>
+          <w:rFonts w:ascii="Times New Roman" w:hAnsi="Times New Roman" w:eastAsia="Times New Roman"/>
+          <w:color w:val="000000"/>
+          <w:sz w:val="22"/>
+        </w:rPr>
+        <w:t xml:space="preserve">(2025) found that realistic AI-synthesized images can strengthen belief in misinformation</w:t>
+      </w:r>
+      <w:r>
+        <w:rPr>
+          <w:rFonts w:ascii="Times New Roman" w:hAnsi="Times New Roman" w:eastAsia="Times New Roman"/>
+          <w:color w:val="000000"/>
+          <w:sz w:val="22"/>
+        </w:rPr>
+        <w:t xml:space="preserve"> </w:t>
+      </w:r>
+      <w:r>
+        <w:rPr>
+          <w:rFonts w:ascii="Times New Roman" w:hAnsi="Times New Roman" w:eastAsia="Times New Roman"/>
+          <w:color w:val="000000"/>
+          <w:sz w:val="22"/>
+        </w:rPr>
+        <w:t xml:space="preserve">when they appear to support a claim. In the present survey, AI-generated images did not</w:t>
+      </w:r>
+      <w:r>
+        <w:rPr>
+          <w:rFonts w:ascii="Times New Roman" w:hAnsi="Times New Roman" w:eastAsia="Times New Roman"/>
+          <w:color w:val="000000"/>
+          <w:sz w:val="22"/>
+        </w:rPr>
+        <w:t xml:space="preserve"> </w:t>
+      </w:r>
+      <w:r>
+        <w:rPr>
+          <w:rFonts w:ascii="Times New Roman" w:hAnsi="Times New Roman" w:eastAsia="Times New Roman"/>
+          <w:color w:val="000000"/>
+          <w:sz w:val="22"/>
+        </w:rPr>
+        <w:t xml:space="preserve">receive high trust ratings overall, but they were sometimes trusted at levels close to real</w:t>
+      </w:r>
+      <w:r>
+        <w:rPr>
+          <w:rFonts w:ascii="Times New Roman" w:hAnsi="Times New Roman" w:eastAsia="Times New Roman"/>
+          <w:color w:val="000000"/>
+          <w:sz w:val="22"/>
+        </w:rPr>
+        <w:t xml:space="preserve"> </w:t>
+      </w:r>
+      <w:r>
+        <w:rPr>
+          <w:rFonts w:ascii="Times New Roman" w:hAnsi="Times New Roman" w:eastAsia="Times New Roman"/>
+          <w:color w:val="000000"/>
+          <w:sz w:val="22"/>
+        </w:rPr>
+        <w:t xml:space="preserve">images. This matters because even moderate trust may be enough to make an online claim appear</w:t>
+      </w:r>
+      <w:r>
+        <w:rPr>
+          <w:rFonts w:ascii="Times New Roman" w:hAnsi="Times New Roman" w:eastAsia="Times New Roman"/>
+          <w:color w:val="000000"/>
+          <w:sz w:val="22"/>
+        </w:rPr>
+        <w:t xml:space="preserve"> </w:t>
+      </w:r>
+      <w:r>
+        <w:rPr>
+          <w:rFonts w:ascii="Times New Roman" w:hAnsi="Times New Roman" w:eastAsia="Times New Roman"/>
+          <w:color w:val="000000"/>
+          <w:sz w:val="22"/>
+        </w:rPr>
+        <w:t xml:space="preserve">more credible.</w:t>
       </w:r>
     </w:p>
     <w:p>
@@ -6193,91 +6875,75 @@
           <w:color w:val="000000"/>
           <w:sz w:val="22"/>
         </w:rPr>
-        <w:t xml:space="preserve">The material creation route analysis adds a further qualification. AI images created through</w:t>
-      </w:r>
-      <w:r>
-        <w:rPr>
-          <w:rFonts w:ascii="Times New Roman" w:hAnsi="Times New Roman" w:eastAsia="Times New Roman"/>
-          <w:color w:val="000000"/>
-          <w:sz w:val="22"/>
-        </w:rPr>
-        <w:t xml:space="preserve"> </w:t>
-      </w:r>
-      <w:r>
-        <w:rPr>
-          <w:rFonts w:ascii="Times New Roman" w:hAnsi="Times New Roman" w:eastAsia="Times New Roman"/>
-          <w:color w:val="000000"/>
-          <w:sz w:val="22"/>
-        </w:rPr>
-        <w:t xml:space="preserve">real-to-AI modification were less accurately identified than AI images in the AI-first</w:t>
-      </w:r>
-      <w:r>
-        <w:rPr>
-          <w:rFonts w:ascii="Times New Roman" w:hAnsi="Times New Roman" w:eastAsia="Times New Roman"/>
-          <w:color w:val="000000"/>
-          <w:sz w:val="22"/>
-        </w:rPr>
-        <w:t xml:space="preserve"> </w:t>
-      </w:r>
-      <w:r>
-        <w:rPr>
-          <w:rFonts w:ascii="Times New Roman" w:hAnsi="Times New Roman" w:eastAsia="Times New Roman"/>
-          <w:color w:val="000000"/>
-          <w:sz w:val="22"/>
-        </w:rPr>
-        <w:t xml:space="preserve">matched-real route. They also received higher trust ratings. This suggests that when AI</w:t>
-      </w:r>
-      <w:r>
-        <w:rPr>
-          <w:rFonts w:ascii="Times New Roman" w:hAnsi="Times New Roman" w:eastAsia="Times New Roman"/>
-          <w:color w:val="000000"/>
-          <w:sz w:val="22"/>
-        </w:rPr>
-        <w:t xml:space="preserve"> </w:t>
-      </w:r>
-      <w:r>
-        <w:rPr>
-          <w:rFonts w:ascii="Times New Roman" w:hAnsi="Times New Roman" w:eastAsia="Times New Roman"/>
-          <w:color w:val="000000"/>
-          <w:sz w:val="22"/>
-        </w:rPr>
-        <w:t xml:space="preserve">generation preserves the composition, subject matter, or visual realism of a real reference,</w:t>
-      </w:r>
-      <w:r>
-        <w:rPr>
-          <w:rFonts w:ascii="Times New Roman" w:hAnsi="Times New Roman" w:eastAsia="Times New Roman"/>
-          <w:color w:val="000000"/>
-          <w:sz w:val="22"/>
-        </w:rPr>
-        <w:t xml:space="preserve"> </w:t>
-      </w:r>
-      <w:r>
-        <w:rPr>
-          <w:rFonts w:ascii="Times New Roman" w:hAnsi="Times New Roman" w:eastAsia="Times New Roman"/>
-          <w:color w:val="000000"/>
-          <w:sz w:val="22"/>
-        </w:rPr>
-        <w:t xml:space="preserve">the resulting synthetic image may be more difficult to separate from authentic visual</w:t>
-      </w:r>
-      <w:r>
-        <w:rPr>
-          <w:rFonts w:ascii="Times New Roman" w:hAnsi="Times New Roman" w:eastAsia="Times New Roman"/>
-          <w:color w:val="000000"/>
-          <w:sz w:val="22"/>
-        </w:rPr>
-        <w:t xml:space="preserve"> </w:t>
-      </w:r>
-      <w:r>
-        <w:rPr>
-          <w:rFonts w:ascii="Times New Roman" w:hAnsi="Times New Roman" w:eastAsia="Times New Roman"/>
-          <w:color w:val="000000"/>
-          <w:sz w:val="22"/>
-        </w:rPr>
-        <w:t xml:space="preserve">material.</w:t>
+        <w:t xml:space="preserve">Finally, the findings support Inwood and Zappavigna’s (2024) argument that screenshots often</w:t>
+      </w:r>
+      <w:r>
+        <w:rPr>
+          <w:rFonts w:ascii="Times New Roman" w:hAnsi="Times New Roman" w:eastAsia="Times New Roman"/>
+          <w:color w:val="000000"/>
+          <w:sz w:val="22"/>
+        </w:rPr>
+        <w:t xml:space="preserve"> </w:t>
+      </w:r>
+      <w:r>
+        <w:rPr>
+          <w:rFonts w:ascii="Times New Roman" w:hAnsi="Times New Roman" w:eastAsia="Times New Roman"/>
+          <w:color w:val="000000"/>
+          <w:sz w:val="22"/>
+        </w:rPr>
+        <w:t xml:space="preserve">function as visual evidence. Respondents tended to agree that platform elements such as</w:t>
+      </w:r>
+      <w:r>
+        <w:rPr>
+          <w:rFonts w:ascii="Times New Roman" w:hAnsi="Times New Roman" w:eastAsia="Times New Roman"/>
+          <w:color w:val="000000"/>
+          <w:sz w:val="22"/>
+        </w:rPr>
+        <w:t xml:space="preserve"> </w:t>
+      </w:r>
+      <w:r>
+        <w:rPr>
+          <w:rFonts w:ascii="Times New Roman" w:hAnsi="Times New Roman" w:eastAsia="Times New Roman"/>
+          <w:color w:val="000000"/>
+          <w:sz w:val="22"/>
+        </w:rPr>
+        <w:t xml:space="preserve">interfaces, comments, and livestream features can make screenshots more believable. Therefore,</w:t>
+      </w:r>
+      <w:r>
+        <w:rPr>
+          <w:rFonts w:ascii="Times New Roman" w:hAnsi="Times New Roman" w:eastAsia="Times New Roman"/>
+          <w:color w:val="000000"/>
+          <w:sz w:val="22"/>
+        </w:rPr>
+        <w:t xml:space="preserve"> </w:t>
+      </w:r>
+      <w:r>
+        <w:rPr>
+          <w:rFonts w:ascii="Times New Roman" w:hAnsi="Times New Roman" w:eastAsia="Times New Roman"/>
+          <w:color w:val="000000"/>
+          <w:sz w:val="22"/>
+        </w:rPr>
+        <w:t xml:space="preserve">the risk of AI-generated visual misinformation should not be understood only as a problem of</w:t>
+      </w:r>
+      <w:r>
+        <w:rPr>
+          <w:rFonts w:ascii="Times New Roman" w:hAnsi="Times New Roman" w:eastAsia="Times New Roman"/>
+          <w:color w:val="000000"/>
+          <w:sz w:val="22"/>
+        </w:rPr>
+        <w:t xml:space="preserve"> </w:t>
+      </w:r>
+      <w:r>
+        <w:rPr>
+          <w:rFonts w:ascii="Times New Roman" w:hAnsi="Times New Roman" w:eastAsia="Times New Roman"/>
+          <w:color w:val="000000"/>
+          <w:sz w:val="22"/>
+        </w:rPr>
+        <w:t xml:space="preserve">fake photographs. It should also be understood as a problem of fake platform context.</w:t>
       </w:r>
     </w:p>
-    <w:bookmarkEnd w:id="41"/>
-    <w:bookmarkStart w:id="42" w:name="comparison-with-previous-studies"/>
+    <w:bookmarkEnd w:id="45"/>
+    <w:bookmarkStart w:id="46" w:name="possible-explanations"/>
     <w:p>
       <w:pPr>
         <w:pStyle w:val="Heading3"/>
@@ -6290,7 +6956,7 @@
           <w:color w:val="000000"/>
           <w:sz w:val="22"/>
         </w:rPr>
-        <w:t xml:space="preserve">5.2 Comparison with Previous Studies</w:t>
+        <w:t xml:space="preserve">5.3 Possible Explanations</w:t>
       </w:r>
     </w:p>
     <w:p>
@@ -6305,87 +6971,87 @@
           <w:color w:val="000000"/>
           <w:sz w:val="22"/>
         </w:rPr>
-        <w:t xml:space="preserve">The findings align with previous studies showing that human detection of AI-generated media</w:t>
-      </w:r>
-      <w:r>
-        <w:rPr>
-          <w:rFonts w:ascii="Times New Roman" w:hAnsi="Times New Roman" w:eastAsia="Times New Roman"/>
-          <w:color w:val="000000"/>
-          <w:sz w:val="22"/>
-        </w:rPr>
-        <w:t xml:space="preserve"> </w:t>
-      </w:r>
-      <w:r>
-        <w:rPr>
-          <w:rFonts w:ascii="Times New Roman" w:hAnsi="Times New Roman" w:eastAsia="Times New Roman"/>
-          <w:color w:val="000000"/>
-          <w:sz w:val="22"/>
-        </w:rPr>
-        <w:t xml:space="preserve">is limited. Frank et al. (2024) found that many participants performed close to chance level</w:t>
-      </w:r>
-      <w:r>
-        <w:rPr>
-          <w:rFonts w:ascii="Times New Roman" w:hAnsi="Times New Roman" w:eastAsia="Times New Roman"/>
-          <w:color w:val="000000"/>
-          <w:sz w:val="22"/>
-        </w:rPr>
-        <w:t xml:space="preserve"> </w:t>
-      </w:r>
-      <w:r>
-        <w:rPr>
-          <w:rFonts w:ascii="Times New Roman" w:hAnsi="Times New Roman" w:eastAsia="Times New Roman"/>
-          <w:color w:val="000000"/>
-          <w:sz w:val="22"/>
-        </w:rPr>
-        <w:t xml:space="preserve">across different media types. Roca et al. (2025) also showed that image detection performance</w:t>
-      </w:r>
-      <w:r>
-        <w:rPr>
-          <w:rFonts w:ascii="Times New Roman" w:hAnsi="Times New Roman" w:eastAsia="Times New Roman"/>
-          <w:color w:val="000000"/>
-          <w:sz w:val="22"/>
-        </w:rPr>
-        <w:t xml:space="preserve"> </w:t>
-      </w:r>
-      <w:r>
-        <w:rPr>
-          <w:rFonts w:ascii="Times New Roman" w:hAnsi="Times New Roman" w:eastAsia="Times New Roman"/>
-          <w:color w:val="000000"/>
-          <w:sz w:val="22"/>
-        </w:rPr>
-        <w:t xml:space="preserve">varied by content type. The current survey is much smaller, but its descriptive results point</w:t>
-      </w:r>
-      <w:r>
-        <w:rPr>
-          <w:rFonts w:ascii="Times New Roman" w:hAnsi="Times New Roman" w:eastAsia="Times New Roman"/>
-          <w:color w:val="000000"/>
-          <w:sz w:val="22"/>
-        </w:rPr>
-        <w:t xml:space="preserve"> </w:t>
-      </w:r>
-      <w:r>
-        <w:rPr>
-          <w:rFonts w:ascii="Times New Roman" w:hAnsi="Times New Roman" w:eastAsia="Times New Roman"/>
-          <w:color w:val="000000"/>
-          <w:sz w:val="22"/>
-        </w:rPr>
-        <w:t xml:space="preserve">in the same direction: general familiarity with AI tools does not automatically produce</w:t>
-      </w:r>
-      <w:r>
-        <w:rPr>
-          <w:rFonts w:ascii="Times New Roman" w:hAnsi="Times New Roman" w:eastAsia="Times New Roman"/>
-          <w:color w:val="000000"/>
-          <w:sz w:val="22"/>
-        </w:rPr>
-        <w:t xml:space="preserve"> </w:t>
-      </w:r>
-      <w:r>
-        <w:rPr>
-          <w:rFonts w:ascii="Times New Roman" w:hAnsi="Times New Roman" w:eastAsia="Times New Roman"/>
-          <w:color w:val="000000"/>
-          <w:sz w:val="22"/>
-        </w:rPr>
-        <w:t xml:space="preserve">reliable detection ability.</w:t>
+        <w:t xml:space="preserve">One possible explanation for the low overall accuracy is that respondents relied heavily on</w:t>
+      </w:r>
+      <w:r>
+        <w:rPr>
+          <w:rFonts w:ascii="Times New Roman" w:hAnsi="Times New Roman" w:eastAsia="Times New Roman"/>
+          <w:color w:val="000000"/>
+          <w:sz w:val="22"/>
+        </w:rPr>
+        <w:t xml:space="preserve"> </w:t>
+      </w:r>
+      <w:r>
+        <w:rPr>
+          <w:rFonts w:ascii="Times New Roman" w:hAnsi="Times New Roman" w:eastAsia="Times New Roman"/>
+          <w:color w:val="000000"/>
+          <w:sz w:val="22"/>
+        </w:rPr>
+        <w:t xml:space="preserve">surface visual cues. Some real food photographs and portraits looked polished, staged, or</w:t>
+      </w:r>
+      <w:r>
+        <w:rPr>
+          <w:rFonts w:ascii="Times New Roman" w:hAnsi="Times New Roman" w:eastAsia="Times New Roman"/>
+          <w:color w:val="000000"/>
+          <w:sz w:val="22"/>
+        </w:rPr>
+        <w:t xml:space="preserve"> </w:t>
+      </w:r>
+      <w:r>
+        <w:rPr>
+          <w:rFonts w:ascii="Times New Roman" w:hAnsi="Times New Roman" w:eastAsia="Times New Roman"/>
+          <w:color w:val="000000"/>
+          <w:sz w:val="22"/>
+        </w:rPr>
+        <w:t xml:space="preserve">digitally processed. Respondents may therefore have classified them as AI-generated. This</w:t>
+      </w:r>
+      <w:r>
+        <w:rPr>
+          <w:rFonts w:ascii="Times New Roman" w:hAnsi="Times New Roman" w:eastAsia="Times New Roman"/>
+          <w:color w:val="000000"/>
+          <w:sz w:val="22"/>
+        </w:rPr>
+        <w:t xml:space="preserve"> </w:t>
+      </w:r>
+      <w:r>
+        <w:rPr>
+          <w:rFonts w:ascii="Times New Roman" w:hAnsi="Times New Roman" w:eastAsia="Times New Roman"/>
+          <w:color w:val="000000"/>
+          <w:sz w:val="22"/>
+        </w:rPr>
+        <w:t xml:space="preserve">helps explain why real images had lower accuracy than AI-generated images. The increasing</w:t>
+      </w:r>
+      <w:r>
+        <w:rPr>
+          <w:rFonts w:ascii="Times New Roman" w:hAnsi="Times New Roman" w:eastAsia="Times New Roman"/>
+          <w:color w:val="000000"/>
+          <w:sz w:val="22"/>
+        </w:rPr>
+        <w:t xml:space="preserve"> </w:t>
+      </w:r>
+      <w:r>
+        <w:rPr>
+          <w:rFonts w:ascii="Times New Roman" w:hAnsi="Times New Roman" w:eastAsia="Times New Roman"/>
+          <w:color w:val="000000"/>
+          <w:sz w:val="22"/>
+        </w:rPr>
+        <w:t xml:space="preserve">presence of synthetic images may lead users not only to believe some false images but also to</w:t>
+      </w:r>
+      <w:r>
+        <w:rPr>
+          <w:rFonts w:ascii="Times New Roman" w:hAnsi="Times New Roman" w:eastAsia="Times New Roman"/>
+          <w:color w:val="000000"/>
+          <w:sz w:val="22"/>
+        </w:rPr>
+        <w:t xml:space="preserve"> </w:t>
+      </w:r>
+      <w:r>
+        <w:rPr>
+          <w:rFonts w:ascii="Times New Roman" w:hAnsi="Times New Roman" w:eastAsia="Times New Roman"/>
+          <w:color w:val="000000"/>
+          <w:sz w:val="22"/>
+        </w:rPr>
+        <w:t xml:space="preserve">doubt real ones.</w:t>
       </w:r>
     </w:p>
     <w:p>
@@ -6400,87 +7066,71 @@
           <w:color w:val="000000"/>
           <w:sz w:val="22"/>
         </w:rPr>
-        <w:t xml:space="preserve">The results also connect with research on misinformation and visual evidence. Guo et al.</w:t>
-      </w:r>
-      <w:r>
-        <w:rPr>
-          <w:rFonts w:ascii="Times New Roman" w:hAnsi="Times New Roman" w:eastAsia="Times New Roman"/>
-          <w:color w:val="000000"/>
-          <w:sz w:val="22"/>
-        </w:rPr>
-        <w:t xml:space="preserve"> </w:t>
-      </w:r>
-      <w:r>
-        <w:rPr>
-          <w:rFonts w:ascii="Times New Roman" w:hAnsi="Times New Roman" w:eastAsia="Times New Roman"/>
-          <w:color w:val="000000"/>
-          <w:sz w:val="22"/>
-        </w:rPr>
-        <w:t xml:space="preserve">(2025) found that realistic AI-synthesized images can strengthen belief in misinformation</w:t>
-      </w:r>
-      <w:r>
-        <w:rPr>
-          <w:rFonts w:ascii="Times New Roman" w:hAnsi="Times New Roman" w:eastAsia="Times New Roman"/>
-          <w:color w:val="000000"/>
-          <w:sz w:val="22"/>
-        </w:rPr>
-        <w:t xml:space="preserve"> </w:t>
-      </w:r>
-      <w:r>
-        <w:rPr>
-          <w:rFonts w:ascii="Times New Roman" w:hAnsi="Times New Roman" w:eastAsia="Times New Roman"/>
-          <w:color w:val="000000"/>
-          <w:sz w:val="22"/>
-        </w:rPr>
-        <w:t xml:space="preserve">when they appear to support a claim. In the present survey, AI-generated images did not</w:t>
-      </w:r>
-      <w:r>
-        <w:rPr>
-          <w:rFonts w:ascii="Times New Roman" w:hAnsi="Times New Roman" w:eastAsia="Times New Roman"/>
-          <w:color w:val="000000"/>
-          <w:sz w:val="22"/>
-        </w:rPr>
-        <w:t xml:space="preserve"> </w:t>
-      </w:r>
-      <w:r>
-        <w:rPr>
-          <w:rFonts w:ascii="Times New Roman" w:hAnsi="Times New Roman" w:eastAsia="Times New Roman"/>
-          <w:color w:val="000000"/>
-          <w:sz w:val="22"/>
-        </w:rPr>
-        <w:t xml:space="preserve">receive high trust ratings overall, but they were sometimes trusted at levels close to real</w:t>
-      </w:r>
-      <w:r>
-        <w:rPr>
-          <w:rFonts w:ascii="Times New Roman" w:hAnsi="Times New Roman" w:eastAsia="Times New Roman"/>
-          <w:color w:val="000000"/>
-          <w:sz w:val="22"/>
-        </w:rPr>
-        <w:t xml:space="preserve"> </w:t>
-      </w:r>
-      <w:r>
-        <w:rPr>
-          <w:rFonts w:ascii="Times New Roman" w:hAnsi="Times New Roman" w:eastAsia="Times New Roman"/>
-          <w:color w:val="000000"/>
-          <w:sz w:val="22"/>
-        </w:rPr>
-        <w:t xml:space="preserve">images. This matters because even moderate trust may be enough to make an online claim appear</w:t>
-      </w:r>
-      <w:r>
-        <w:rPr>
-          <w:rFonts w:ascii="Times New Roman" w:hAnsi="Times New Roman" w:eastAsia="Times New Roman"/>
-          <w:color w:val="000000"/>
-          <w:sz w:val="22"/>
-        </w:rPr>
-        <w:t xml:space="preserve"> </w:t>
-      </w:r>
-      <w:r>
-        <w:rPr>
-          <w:rFonts w:ascii="Times New Roman" w:hAnsi="Times New Roman" w:eastAsia="Times New Roman"/>
-          <w:color w:val="000000"/>
-          <w:sz w:val="22"/>
-        </w:rPr>
-        <w:t xml:space="preserve">more credible.</w:t>
+        <w:t xml:space="preserve">A second explanation is related to the survey materials. The images were selected</w:t>
+      </w:r>
+      <w:r>
+        <w:rPr>
+          <w:rFonts w:ascii="Times New Roman" w:hAnsi="Times New Roman" w:eastAsia="Times New Roman"/>
+          <w:color w:val="000000"/>
+          <w:sz w:val="22"/>
+        </w:rPr>
+        <w:t xml:space="preserve"> </w:t>
+      </w:r>
+      <w:r>
+        <w:rPr>
+          <w:rFonts w:ascii="Times New Roman" w:hAnsi="Times New Roman" w:eastAsia="Times New Roman"/>
+          <w:color w:val="000000"/>
+          <w:sz w:val="22"/>
+        </w:rPr>
+        <w:t xml:space="preserve">purposively, not randomly. The set was designed to compare responses across selected visual</w:t>
+      </w:r>
+      <w:r>
+        <w:rPr>
+          <w:rFonts w:ascii="Times New Roman" w:hAnsi="Times New Roman" w:eastAsia="Times New Roman"/>
+          <w:color w:val="000000"/>
+          <w:sz w:val="22"/>
+        </w:rPr>
+        <w:t xml:space="preserve"> </w:t>
+      </w:r>
+      <w:r>
+        <w:rPr>
+          <w:rFonts w:ascii="Times New Roman" w:hAnsi="Times New Roman" w:eastAsia="Times New Roman"/>
+          <w:color w:val="000000"/>
+          <w:sz w:val="22"/>
+        </w:rPr>
+        <w:t xml:space="preserve">categories, including ordinary photographs and screenshot-like images. This design made it</w:t>
+      </w:r>
+      <w:r>
+        <w:rPr>
+          <w:rFonts w:ascii="Times New Roman" w:hAnsi="Times New Roman" w:eastAsia="Times New Roman"/>
+          <w:color w:val="000000"/>
+          <w:sz w:val="22"/>
+        </w:rPr>
+        <w:t xml:space="preserve"> </w:t>
+      </w:r>
+      <w:r>
+        <w:rPr>
+          <w:rFonts w:ascii="Times New Roman" w:hAnsi="Times New Roman" w:eastAsia="Times New Roman"/>
+          <w:color w:val="000000"/>
+          <w:sz w:val="22"/>
+        </w:rPr>
+        <w:t xml:space="preserve">possible to compare category-level patterns, but it also limits generalization. The results</w:t>
+      </w:r>
+      <w:r>
+        <w:rPr>
+          <w:rFonts w:ascii="Times New Roman" w:hAnsi="Times New Roman" w:eastAsia="Times New Roman"/>
+          <w:color w:val="000000"/>
+          <w:sz w:val="22"/>
+        </w:rPr>
+        <w:t xml:space="preserve"> </w:t>
+      </w:r>
+      <w:r>
+        <w:rPr>
+          <w:rFonts w:ascii="Times New Roman" w:hAnsi="Times New Roman" w:eastAsia="Times New Roman"/>
+          <w:color w:val="000000"/>
+          <w:sz w:val="22"/>
+        </w:rPr>
+        <w:t xml:space="preserve">should therefore be treated as descriptive evidence from a small exploratory survey.</w:t>
       </w:r>
     </w:p>
     <w:p>
@@ -6495,75 +7145,170 @@
           <w:color w:val="000000"/>
           <w:sz w:val="22"/>
         </w:rPr>
-        <w:t xml:space="preserve">Finally, the findings support Inwood and Zappavigna’s (2024) argument that screenshots often</w:t>
-      </w:r>
-      <w:r>
-        <w:rPr>
-          <w:rFonts w:ascii="Times New Roman" w:hAnsi="Times New Roman" w:eastAsia="Times New Roman"/>
-          <w:color w:val="000000"/>
-          <w:sz w:val="22"/>
-        </w:rPr>
-        <w:t xml:space="preserve"> </w:t>
-      </w:r>
-      <w:r>
-        <w:rPr>
-          <w:rFonts w:ascii="Times New Roman" w:hAnsi="Times New Roman" w:eastAsia="Times New Roman"/>
-          <w:color w:val="000000"/>
-          <w:sz w:val="22"/>
-        </w:rPr>
-        <w:t xml:space="preserve">function as visual evidence. Respondents tended to agree that platform elements such as</w:t>
-      </w:r>
-      <w:r>
-        <w:rPr>
-          <w:rFonts w:ascii="Times New Roman" w:hAnsi="Times New Roman" w:eastAsia="Times New Roman"/>
-          <w:color w:val="000000"/>
-          <w:sz w:val="22"/>
-        </w:rPr>
-        <w:t xml:space="preserve"> </w:t>
-      </w:r>
-      <w:r>
-        <w:rPr>
-          <w:rFonts w:ascii="Times New Roman" w:hAnsi="Times New Roman" w:eastAsia="Times New Roman"/>
-          <w:color w:val="000000"/>
-          <w:sz w:val="22"/>
-        </w:rPr>
-        <w:t xml:space="preserve">interfaces, comments, and livestream features can make screenshots more believable. Therefore,</w:t>
-      </w:r>
-      <w:r>
-        <w:rPr>
-          <w:rFonts w:ascii="Times New Roman" w:hAnsi="Times New Roman" w:eastAsia="Times New Roman"/>
-          <w:color w:val="000000"/>
-          <w:sz w:val="22"/>
-        </w:rPr>
-        <w:t xml:space="preserve"> </w:t>
-      </w:r>
-      <w:r>
-        <w:rPr>
-          <w:rFonts w:ascii="Times New Roman" w:hAnsi="Times New Roman" w:eastAsia="Times New Roman"/>
-          <w:color w:val="000000"/>
-          <w:sz w:val="22"/>
-        </w:rPr>
-        <w:t xml:space="preserve">the risk of AI-generated visual misinformation should not be understood only as a problem of</w:t>
-      </w:r>
-      <w:r>
-        <w:rPr>
-          <w:rFonts w:ascii="Times New Roman" w:hAnsi="Times New Roman" w:eastAsia="Times New Roman"/>
-          <w:color w:val="000000"/>
-          <w:sz w:val="22"/>
-        </w:rPr>
-        <w:t xml:space="preserve"> </w:t>
-      </w:r>
-      <w:r>
-        <w:rPr>
-          <w:rFonts w:ascii="Times New Roman" w:hAnsi="Times New Roman" w:eastAsia="Times New Roman"/>
-          <w:color w:val="000000"/>
-          <w:sz w:val="22"/>
-        </w:rPr>
-        <w:t xml:space="preserve">fake photographs. It should also be understood as a problem of fake platform context.</w:t>
+        <w:t xml:space="preserve">A third explanation concerns material creation route. In the AI-first matched-real route, the</w:t>
+      </w:r>
+      <w:r>
+        <w:rPr>
+          <w:rFonts w:ascii="Times New Roman" w:hAnsi="Times New Roman" w:eastAsia="Times New Roman"/>
+          <w:color w:val="000000"/>
+          <w:sz w:val="22"/>
+        </w:rPr>
+        <w:t xml:space="preserve"> </w:t>
+      </w:r>
+      <w:r>
+        <w:rPr>
+          <w:rFonts w:ascii="Times New Roman" w:hAnsi="Times New Roman" w:eastAsia="Times New Roman"/>
+          <w:color w:val="000000"/>
+          <w:sz w:val="22"/>
+        </w:rPr>
+        <w:t xml:space="preserve">AI images may have retained more visible synthetic features, which could explain why they were</w:t>
+      </w:r>
+      <w:r>
+        <w:rPr>
+          <w:rFonts w:ascii="Times New Roman" w:hAnsi="Times New Roman" w:eastAsia="Times New Roman"/>
+          <w:color w:val="000000"/>
+          <w:sz w:val="22"/>
+        </w:rPr>
+        <w:t xml:space="preserve"> </w:t>
+      </w:r>
+      <w:r>
+        <w:rPr>
+          <w:rFonts w:ascii="Times New Roman" w:hAnsi="Times New Roman" w:eastAsia="Times New Roman"/>
+          <w:color w:val="000000"/>
+          <w:sz w:val="22"/>
+        </w:rPr>
+        <w:t xml:space="preserve">identified more accurately. In the real-to-AI modification route, however, the AI image was</w:t>
+      </w:r>
+      <w:r>
+        <w:rPr>
+          <w:rFonts w:ascii="Times New Roman" w:hAnsi="Times New Roman" w:eastAsia="Times New Roman"/>
+          <w:color w:val="000000"/>
+          <w:sz w:val="22"/>
+        </w:rPr>
+        <w:t xml:space="preserve"> </w:t>
+      </w:r>
+      <w:r>
+        <w:rPr>
+          <w:rFonts w:ascii="Times New Roman" w:hAnsi="Times New Roman" w:eastAsia="Times New Roman"/>
+          <w:color w:val="000000"/>
+          <w:sz w:val="22"/>
+        </w:rPr>
+        <w:t xml:space="preserve">based on a real reference. This may have preserved natural composition, lighting, or platform</w:t>
+      </w:r>
+      <w:r>
+        <w:rPr>
+          <w:rFonts w:ascii="Times New Roman" w:hAnsi="Times New Roman" w:eastAsia="Times New Roman"/>
+          <w:color w:val="000000"/>
+          <w:sz w:val="22"/>
+        </w:rPr>
+        <w:t xml:space="preserve"> </w:t>
+      </w:r>
+      <w:r>
+        <w:rPr>
+          <w:rFonts w:ascii="Times New Roman" w:hAnsi="Times New Roman" w:eastAsia="Times New Roman"/>
+          <w:color w:val="000000"/>
+          <w:sz w:val="22"/>
+        </w:rPr>
+        <w:t xml:space="preserve">layout, making the AI-modified image more believable. This interpretation remains tentative</w:t>
+      </w:r>
+      <w:r>
+        <w:rPr>
+          <w:rFonts w:ascii="Times New Roman" w:hAnsi="Times New Roman" w:eastAsia="Times New Roman"/>
+          <w:color w:val="000000"/>
+          <w:sz w:val="22"/>
+        </w:rPr>
+        <w:t xml:space="preserve"> </w:t>
+      </w:r>
+      <w:r>
+        <w:rPr>
+          <w:rFonts w:ascii="Times New Roman" w:hAnsi="Times New Roman" w:eastAsia="Times New Roman"/>
+          <w:color w:val="000000"/>
+          <w:sz w:val="22"/>
+        </w:rPr>
+        <w:t xml:space="preserve">because the route variable was not experimentally controlled.</w:t>
       </w:r>
     </w:p>
-    <w:bookmarkEnd w:id="42"/>
-    <w:bookmarkStart w:id="43" w:name="possible-explanations"/>
+    <w:p>
+      <w:pPr>
+        <w:pStyle w:val="BodyText"/>
+        <w:keepNext w:val="0"/>
+        <w:spacing w:line="480" w:lineRule="auto" w:before="0" w:after="0"/>
+      </w:pPr>
+      <w:r>
+        <w:rPr>
+          <w:rFonts w:ascii="Times New Roman" w:hAnsi="Times New Roman" w:eastAsia="Times New Roman"/>
+          <w:color w:val="000000"/>
+          <w:sz w:val="22"/>
+        </w:rPr>
+        <w:t xml:space="preserve">A fourth explanation concerns visual context. Screenshot-like materials contain contextual</w:t>
+      </w:r>
+      <w:r>
+        <w:rPr>
+          <w:rFonts w:ascii="Times New Roman" w:hAnsi="Times New Roman" w:eastAsia="Times New Roman"/>
+          <w:color w:val="000000"/>
+          <w:sz w:val="22"/>
+        </w:rPr>
+        <w:t xml:space="preserve"> </w:t>
+      </w:r>
+      <w:r>
+        <w:rPr>
+          <w:rFonts w:ascii="Times New Roman" w:hAnsi="Times New Roman" w:eastAsia="Times New Roman"/>
+          <w:color w:val="000000"/>
+          <w:sz w:val="22"/>
+        </w:rPr>
+        <w:t xml:space="preserve">cues, such as usernames, comments, platform layout, product labels, prices, or livestream</w:t>
+      </w:r>
+      <w:r>
+        <w:rPr>
+          <w:rFonts w:ascii="Times New Roman" w:hAnsi="Times New Roman" w:eastAsia="Times New Roman"/>
+          <w:color w:val="000000"/>
+          <w:sz w:val="22"/>
+        </w:rPr>
+        <w:t xml:space="preserve"> </w:t>
+      </w:r>
+      <w:r>
+        <w:rPr>
+          <w:rFonts w:ascii="Times New Roman" w:hAnsi="Times New Roman" w:eastAsia="Times New Roman"/>
+          <w:color w:val="000000"/>
+          <w:sz w:val="22"/>
+        </w:rPr>
+        <w:t xml:space="preserve">interfaces. These cues can make an image feel less like a standalone picture and more like a</w:t>
+      </w:r>
+      <w:r>
+        <w:rPr>
+          <w:rFonts w:ascii="Times New Roman" w:hAnsi="Times New Roman" w:eastAsia="Times New Roman"/>
+          <w:color w:val="000000"/>
+          <w:sz w:val="22"/>
+        </w:rPr>
+        <w:t xml:space="preserve"> </w:t>
+      </w:r>
+      <w:r>
+        <w:rPr>
+          <w:rFonts w:ascii="Times New Roman" w:hAnsi="Times New Roman" w:eastAsia="Times New Roman"/>
+          <w:color w:val="000000"/>
+          <w:sz w:val="22"/>
+        </w:rPr>
+        <w:t xml:space="preserve">record of an online event. Even when viewers are uncertain about the source of an image, such</w:t>
+      </w:r>
+      <w:r>
+        <w:rPr>
+          <w:rFonts w:ascii="Times New Roman" w:hAnsi="Times New Roman" w:eastAsia="Times New Roman"/>
+          <w:color w:val="000000"/>
+          <w:sz w:val="22"/>
+        </w:rPr>
+        <w:t xml:space="preserve"> </w:t>
+      </w:r>
+      <w:r>
+        <w:rPr>
+          <w:rFonts w:ascii="Times New Roman" w:hAnsi="Times New Roman" w:eastAsia="Times New Roman"/>
+          <w:color w:val="000000"/>
+          <w:sz w:val="22"/>
+        </w:rPr>
+        <w:t xml:space="preserve">contextual cues may increase the image’s perceived credibility.</w:t>
+      </w:r>
+    </w:p>
+    <w:bookmarkEnd w:id="46"/>
+    <w:bookmarkStart w:id="47" w:name="limitations-and-implications"/>
     <w:p>
       <w:pPr>
         <w:pStyle w:val="Heading3"/>
@@ -6576,7 +7321,7 @@
           <w:color w:val="000000"/>
           <w:sz w:val="22"/>
         </w:rPr>
-        <w:t xml:space="preserve">5.3 Possible Explanations</w:t>
+        <w:t xml:space="preserve">5.4 Limitations and Implications</w:t>
       </w:r>
     </w:p>
     <w:p>
@@ -6591,87 +7336,167 @@
           <w:color w:val="000000"/>
           <w:sz w:val="22"/>
         </w:rPr>
-        <w:t xml:space="preserve">One possible explanation for the low overall accuracy is that respondents relied heavily on</w:t>
-      </w:r>
-      <w:r>
-        <w:rPr>
-          <w:rFonts w:ascii="Times New Roman" w:hAnsi="Times New Roman" w:eastAsia="Times New Roman"/>
-          <w:color w:val="000000"/>
-          <w:sz w:val="22"/>
-        </w:rPr>
-        <w:t xml:space="preserve"> </w:t>
-      </w:r>
-      <w:r>
-        <w:rPr>
-          <w:rFonts w:ascii="Times New Roman" w:hAnsi="Times New Roman" w:eastAsia="Times New Roman"/>
-          <w:color w:val="000000"/>
-          <w:sz w:val="22"/>
-        </w:rPr>
-        <w:t xml:space="preserve">surface visual cues. Some real food photographs and portraits looked polished, staged, or</w:t>
-      </w:r>
-      <w:r>
-        <w:rPr>
-          <w:rFonts w:ascii="Times New Roman" w:hAnsi="Times New Roman" w:eastAsia="Times New Roman"/>
-          <w:color w:val="000000"/>
-          <w:sz w:val="22"/>
-        </w:rPr>
-        <w:t xml:space="preserve"> </w:t>
-      </w:r>
-      <w:r>
-        <w:rPr>
-          <w:rFonts w:ascii="Times New Roman" w:hAnsi="Times New Roman" w:eastAsia="Times New Roman"/>
-          <w:color w:val="000000"/>
-          <w:sz w:val="22"/>
-        </w:rPr>
-        <w:t xml:space="preserve">digitally processed. Respondents may therefore have classified them as AI-generated. This</w:t>
-      </w:r>
-      <w:r>
-        <w:rPr>
-          <w:rFonts w:ascii="Times New Roman" w:hAnsi="Times New Roman" w:eastAsia="Times New Roman"/>
-          <w:color w:val="000000"/>
-          <w:sz w:val="22"/>
-        </w:rPr>
-        <w:t xml:space="preserve"> </w:t>
-      </w:r>
-      <w:r>
-        <w:rPr>
-          <w:rFonts w:ascii="Times New Roman" w:hAnsi="Times New Roman" w:eastAsia="Times New Roman"/>
-          <w:color w:val="000000"/>
-          <w:sz w:val="22"/>
-        </w:rPr>
-        <w:t xml:space="preserve">helps explain why real images had lower accuracy than AI-generated images. The increasing</w:t>
-      </w:r>
-      <w:r>
-        <w:rPr>
-          <w:rFonts w:ascii="Times New Roman" w:hAnsi="Times New Roman" w:eastAsia="Times New Roman"/>
-          <w:color w:val="000000"/>
-          <w:sz w:val="22"/>
-        </w:rPr>
-        <w:t xml:space="preserve"> </w:t>
-      </w:r>
-      <w:r>
-        <w:rPr>
-          <w:rFonts w:ascii="Times New Roman" w:hAnsi="Times New Roman" w:eastAsia="Times New Roman"/>
-          <w:color w:val="000000"/>
-          <w:sz w:val="22"/>
-        </w:rPr>
-        <w:t xml:space="preserve">presence of synthetic images may lead users not only to believe some false images but also to</w:t>
-      </w:r>
-      <w:r>
-        <w:rPr>
-          <w:rFonts w:ascii="Times New Roman" w:hAnsi="Times New Roman" w:eastAsia="Times New Roman"/>
-          <w:color w:val="000000"/>
-          <w:sz w:val="22"/>
-        </w:rPr>
-        <w:t xml:space="preserve"> </w:t>
-      </w:r>
-      <w:r>
-        <w:rPr>
-          <w:rFonts w:ascii="Times New Roman" w:hAnsi="Times New Roman" w:eastAsia="Times New Roman"/>
-          <w:color w:val="000000"/>
-          <w:sz w:val="22"/>
-        </w:rPr>
-        <w:t xml:space="preserve">doubt real ones.</w:t>
+        <w:t xml:space="preserve">Several limitations should be acknowledged. First, the survey used a small convenience sample</w:t>
+      </w:r>
+      <w:r>
+        <w:rPr>
+          <w:rFonts w:ascii="Times New Roman" w:hAnsi="Times New Roman" w:eastAsia="Times New Roman"/>
+          <w:color w:val="000000"/>
+          <w:sz w:val="22"/>
+        </w:rPr>
+        <w:t xml:space="preserve"> </w:t>
+      </w:r>
+      <w:r>
+        <w:rPr>
+          <w:rFonts w:ascii="Times New Roman" w:hAnsi="Times New Roman" w:eastAsia="Times New Roman"/>
+          <w:color w:val="000000"/>
+          <w:sz w:val="22"/>
+        </w:rPr>
+        <w:t xml:space="preserve">of university-level respondents, so the findings should not be generalized to all social</w:t>
+      </w:r>
+      <w:r>
+        <w:rPr>
+          <w:rFonts w:ascii="Times New Roman" w:hAnsi="Times New Roman" w:eastAsia="Times New Roman"/>
+          <w:color w:val="000000"/>
+          <w:sz w:val="22"/>
+        </w:rPr>
+        <w:t xml:space="preserve"> </w:t>
+      </w:r>
+      <w:r>
+        <w:rPr>
+          <w:rFonts w:ascii="Times New Roman" w:hAnsi="Times New Roman" w:eastAsia="Times New Roman"/>
+          <w:color w:val="000000"/>
+          <w:sz w:val="22"/>
+        </w:rPr>
+        <w:t xml:space="preserve">media users. Second, the stimulus set contained only 18 images, and differences in topic,</w:t>
+      </w:r>
+      <w:r>
+        <w:rPr>
+          <w:rFonts w:ascii="Times New Roman" w:hAnsi="Times New Roman" w:eastAsia="Times New Roman"/>
+          <w:color w:val="000000"/>
+          <w:sz w:val="22"/>
+        </w:rPr>
+        <w:t xml:space="preserve"> </w:t>
+      </w:r>
+      <w:r>
+        <w:rPr>
+          <w:rFonts w:ascii="Times New Roman" w:hAnsi="Times New Roman" w:eastAsia="Times New Roman"/>
+          <w:color w:val="000000"/>
+          <w:sz w:val="22"/>
+        </w:rPr>
+        <w:t xml:space="preserve">image quality, platform style, and visual familiarity may have influenced respondents’</w:t>
+      </w:r>
+      <w:r>
+        <w:rPr>
+          <w:rFonts w:ascii="Times New Roman" w:hAnsi="Times New Roman" w:eastAsia="Times New Roman"/>
+          <w:color w:val="000000"/>
+          <w:sz w:val="22"/>
+        </w:rPr>
+        <w:t xml:space="preserve"> </w:t>
+      </w:r>
+      <w:r>
+        <w:rPr>
+          <w:rFonts w:ascii="Times New Roman" w:hAnsi="Times New Roman" w:eastAsia="Times New Roman"/>
+          <w:color w:val="000000"/>
+          <w:sz w:val="22"/>
+        </w:rPr>
+        <w:t xml:space="preserve">judgements. Third, the two material creation routes were not randomly assigned or evenly</w:t>
+      </w:r>
+      <w:r>
+        <w:rPr>
+          <w:rFonts w:ascii="Times New Roman" w:hAnsi="Times New Roman" w:eastAsia="Times New Roman"/>
+          <w:color w:val="000000"/>
+          <w:sz w:val="22"/>
+        </w:rPr>
+        <w:t xml:space="preserve"> </w:t>
+      </w:r>
+      <w:r>
+        <w:rPr>
+          <w:rFonts w:ascii="Times New Roman" w:hAnsi="Times New Roman" w:eastAsia="Times New Roman"/>
+          <w:color w:val="000000"/>
+          <w:sz w:val="22"/>
+        </w:rPr>
+        <w:t xml:space="preserve">distributed across all categories, so the route analysis should be interpreted as exploratory.</w:t>
+      </w:r>
+      <w:r>
+        <w:rPr>
+          <w:rFonts w:ascii="Times New Roman" w:hAnsi="Times New Roman" w:eastAsia="Times New Roman"/>
+          <w:color w:val="000000"/>
+          <w:sz w:val="22"/>
+        </w:rPr>
+        <w:t xml:space="preserve"> </w:t>
+      </w:r>
+      <w:r>
+        <w:rPr>
+          <w:rFonts w:ascii="Times New Roman" w:hAnsi="Times New Roman" w:eastAsia="Times New Roman"/>
+          <w:color w:val="000000"/>
+          <w:sz w:val="22"/>
+        </w:rPr>
+        <w:t xml:space="preserve">Fourth, the original prompts used to generate the AI images were not fully preserved. The</w:t>
+      </w:r>
+      <w:r>
+        <w:rPr>
+          <w:rFonts w:ascii="Times New Roman" w:hAnsi="Times New Roman" w:eastAsia="Times New Roman"/>
+          <w:color w:val="000000"/>
+          <w:sz w:val="22"/>
+        </w:rPr>
+        <w:t xml:space="preserve"> </w:t>
+      </w:r>
+      <w:r>
+        <w:rPr>
+          <w:rFonts w:ascii="Times New Roman" w:hAnsi="Times New Roman" w:eastAsia="Times New Roman"/>
+          <w:color w:val="000000"/>
+          <w:sz w:val="22"/>
+        </w:rPr>
+        <w:t xml:space="preserve">prompt appendix therefore provides reconstructed documentation rather than an exact record of</w:t>
+      </w:r>
+      <w:r>
+        <w:rPr>
+          <w:rFonts w:ascii="Times New Roman" w:hAnsi="Times New Roman" w:eastAsia="Times New Roman"/>
+          <w:color w:val="000000"/>
+          <w:sz w:val="22"/>
+        </w:rPr>
+        <w:t xml:space="preserve"> </w:t>
+      </w:r>
+      <w:r>
+        <w:rPr>
+          <w:rFonts w:ascii="Times New Roman" w:hAnsi="Times New Roman" w:eastAsia="Times New Roman"/>
+          <w:color w:val="000000"/>
+          <w:sz w:val="22"/>
+        </w:rPr>
+        <w:t xml:space="preserve">the original generation process. Finally, because the study used descriptive statistics, it</w:t>
+      </w:r>
+      <w:r>
+        <w:rPr>
+          <w:rFonts w:ascii="Times New Roman" w:hAnsi="Times New Roman" w:eastAsia="Times New Roman"/>
+          <w:color w:val="000000"/>
+          <w:sz w:val="22"/>
+        </w:rPr>
+        <w:t xml:space="preserve"> </w:t>
+      </w:r>
+      <w:r>
+        <w:rPr>
+          <w:rFonts w:ascii="Times New Roman" w:hAnsi="Times New Roman" w:eastAsia="Times New Roman"/>
+          <w:color w:val="000000"/>
+          <w:sz w:val="22"/>
+        </w:rPr>
+        <w:t xml:space="preserve">cannot establish causal relationships between image type, trust, production route, and source</w:t>
+      </w:r>
+      <w:r>
+        <w:rPr>
+          <w:rFonts w:ascii="Times New Roman" w:hAnsi="Times New Roman" w:eastAsia="Times New Roman"/>
+          <w:color w:val="000000"/>
+          <w:sz w:val="22"/>
+        </w:rPr>
+        <w:t xml:space="preserve"> </w:t>
+      </w:r>
+      <w:r>
+        <w:rPr>
+          <w:rFonts w:ascii="Times New Roman" w:hAnsi="Times New Roman" w:eastAsia="Times New Roman"/>
+          <w:color w:val="000000"/>
+          <w:sz w:val="22"/>
+        </w:rPr>
+        <w:t xml:space="preserve">judgement.</w:t>
       </w:r>
     </w:p>
     <w:p>
@@ -6686,71 +7511,230 @@
           <w:color w:val="000000"/>
           <w:sz w:val="22"/>
         </w:rPr>
-        <w:t xml:space="preserve">A second explanation is related to the survey materials. The images were selected</w:t>
-      </w:r>
-      <w:r>
-        <w:rPr>
-          <w:rFonts w:ascii="Times New Roman" w:hAnsi="Times New Roman" w:eastAsia="Times New Roman"/>
-          <w:color w:val="000000"/>
-          <w:sz w:val="22"/>
-        </w:rPr>
-        <w:t xml:space="preserve"> </w:t>
-      </w:r>
-      <w:r>
-        <w:rPr>
-          <w:rFonts w:ascii="Times New Roman" w:hAnsi="Times New Roman" w:eastAsia="Times New Roman"/>
-          <w:color w:val="000000"/>
-          <w:sz w:val="22"/>
-        </w:rPr>
-        <w:t xml:space="preserve">purposively, not randomly. The set was designed to compare responses across selected visual</w:t>
-      </w:r>
-      <w:r>
-        <w:rPr>
-          <w:rFonts w:ascii="Times New Roman" w:hAnsi="Times New Roman" w:eastAsia="Times New Roman"/>
-          <w:color w:val="000000"/>
-          <w:sz w:val="22"/>
-        </w:rPr>
-        <w:t xml:space="preserve"> </w:t>
-      </w:r>
-      <w:r>
-        <w:rPr>
-          <w:rFonts w:ascii="Times New Roman" w:hAnsi="Times New Roman" w:eastAsia="Times New Roman"/>
-          <w:color w:val="000000"/>
-          <w:sz w:val="22"/>
-        </w:rPr>
-        <w:t xml:space="preserve">categories, including ordinary photographs and screenshot-like images. This design made it</w:t>
-      </w:r>
-      <w:r>
-        <w:rPr>
-          <w:rFonts w:ascii="Times New Roman" w:hAnsi="Times New Roman" w:eastAsia="Times New Roman"/>
-          <w:color w:val="000000"/>
-          <w:sz w:val="22"/>
-        </w:rPr>
-        <w:t xml:space="preserve"> </w:t>
-      </w:r>
-      <w:r>
-        <w:rPr>
-          <w:rFonts w:ascii="Times New Roman" w:hAnsi="Times New Roman" w:eastAsia="Times New Roman"/>
-          <w:color w:val="000000"/>
-          <w:sz w:val="22"/>
-        </w:rPr>
-        <w:t xml:space="preserve">possible to compare category-level patterns, but it also limits generalization. The results</w:t>
-      </w:r>
-      <w:r>
-        <w:rPr>
-          <w:rFonts w:ascii="Times New Roman" w:hAnsi="Times New Roman" w:eastAsia="Times New Roman"/>
-          <w:color w:val="000000"/>
-          <w:sz w:val="22"/>
-        </w:rPr>
-        <w:t xml:space="preserve"> </w:t>
-      </w:r>
-      <w:r>
-        <w:rPr>
-          <w:rFonts w:ascii="Times New Roman" w:hAnsi="Times New Roman" w:eastAsia="Times New Roman"/>
-          <w:color w:val="000000"/>
-          <w:sz w:val="22"/>
-        </w:rPr>
-        <w:t xml:space="preserve">should therefore be treated as descriptive evidence from a small exploratory survey.</w:t>
+        <w:t xml:space="preserve">Despite these limitations, the findings have practical implications. Platforms and educators</w:t>
+      </w:r>
+      <w:r>
+        <w:rPr>
+          <w:rFonts w:ascii="Times New Roman" w:hAnsi="Times New Roman" w:eastAsia="Times New Roman"/>
+          <w:color w:val="000000"/>
+          <w:sz w:val="22"/>
+        </w:rPr>
+        <w:t xml:space="preserve"> </w:t>
+      </w:r>
+      <w:r>
+        <w:rPr>
+          <w:rFonts w:ascii="Times New Roman" w:hAnsi="Times New Roman" w:eastAsia="Times New Roman"/>
+          <w:color w:val="000000"/>
+          <w:sz w:val="22"/>
+        </w:rPr>
+        <w:t xml:space="preserve">should not assume that users can reliably identify AI-generated images through visual</w:t>
+      </w:r>
+      <w:r>
+        <w:rPr>
+          <w:rFonts w:ascii="Times New Roman" w:hAnsi="Times New Roman" w:eastAsia="Times New Roman"/>
+          <w:color w:val="000000"/>
+          <w:sz w:val="22"/>
+        </w:rPr>
+        <w:t xml:space="preserve"> </w:t>
+      </w:r>
+      <w:r>
+        <w:rPr>
+          <w:rFonts w:ascii="Times New Roman" w:hAnsi="Times New Roman" w:eastAsia="Times New Roman"/>
+          <w:color w:val="000000"/>
+          <w:sz w:val="22"/>
+        </w:rPr>
+        <w:t xml:space="preserve">inspection alone. Media literacy education should teach users to verify sources and contexts,</w:t>
+      </w:r>
+      <w:r>
+        <w:rPr>
+          <w:rFonts w:ascii="Times New Roman" w:hAnsi="Times New Roman" w:eastAsia="Times New Roman"/>
+          <w:color w:val="000000"/>
+          <w:sz w:val="22"/>
+        </w:rPr>
+        <w:t xml:space="preserve"> </w:t>
+      </w:r>
+      <w:r>
+        <w:rPr>
+          <w:rFonts w:ascii="Times New Roman" w:hAnsi="Times New Roman" w:eastAsia="Times New Roman"/>
+          <w:color w:val="000000"/>
+          <w:sz w:val="22"/>
+        </w:rPr>
+        <w:t xml:space="preserve">not merely to search for visual flaws. Platform labels, content provenance systems, and</w:t>
+      </w:r>
+      <w:r>
+        <w:rPr>
+          <w:rFonts w:ascii="Times New Roman" w:hAnsi="Times New Roman" w:eastAsia="Times New Roman"/>
+          <w:color w:val="000000"/>
+          <w:sz w:val="22"/>
+        </w:rPr>
+        <w:t xml:space="preserve"> </w:t>
+      </w:r>
+      <w:r>
+        <w:rPr>
+          <w:rFonts w:ascii="Times New Roman" w:hAnsi="Times New Roman" w:eastAsia="Times New Roman"/>
+          <w:color w:val="000000"/>
+          <w:sz w:val="22"/>
+        </w:rPr>
+        <w:t xml:space="preserve">watermarking may also help, but they should be treated as part of a broader response rather</w:t>
+      </w:r>
+      <w:r>
+        <w:rPr>
+          <w:rFonts w:ascii="Times New Roman" w:hAnsi="Times New Roman" w:eastAsia="Times New Roman"/>
+          <w:color w:val="000000"/>
+          <w:sz w:val="22"/>
+        </w:rPr>
+        <w:t xml:space="preserve"> </w:t>
+      </w:r>
+      <w:r>
+        <w:rPr>
+          <w:rFonts w:ascii="Times New Roman" w:hAnsi="Times New Roman" w:eastAsia="Times New Roman"/>
+          <w:color w:val="000000"/>
+          <w:sz w:val="22"/>
+        </w:rPr>
+        <w:t xml:space="preserve">than as a complete solution. As images move across platforms, are compressed, edited, or</w:t>
+      </w:r>
+      <w:r>
+        <w:rPr>
+          <w:rFonts w:ascii="Times New Roman" w:hAnsi="Times New Roman" w:eastAsia="Times New Roman"/>
+          <w:color w:val="000000"/>
+          <w:sz w:val="22"/>
+        </w:rPr>
+        <w:t xml:space="preserve"> </w:t>
+      </w:r>
+      <w:r>
+        <w:rPr>
+          <w:rFonts w:ascii="Times New Roman" w:hAnsi="Times New Roman" w:eastAsia="Times New Roman"/>
+          <w:color w:val="000000"/>
+          <w:sz w:val="22"/>
+        </w:rPr>
+        <w:t xml:space="preserve">screenshotted, the reliability of provenance signals may vary.</w:t>
+      </w:r>
+    </w:p>
+    <w:bookmarkEnd w:id="47"/>
+    <w:bookmarkEnd w:id="48"/>
+    <w:bookmarkStart w:id="49" w:name="conclusion"/>
+    <w:p>
+      <w:pPr>
+        <w:keepNext w:val="0"/>
+        <w:spacing w:line="480" w:lineRule="auto" w:before="0" w:after="0"/>
+      </w:pPr>
+      <w:r>
+        <w:rPr>
+          <w:rFonts w:ascii="Times New Roman" w:hAnsi="Times New Roman" w:eastAsia="Times New Roman"/>
+          <w:color w:val="000000"/>
+          <w:sz w:val="22"/>
+        </w:rPr>
+        <w:br w:type="page"/>
+      </w:r>
+    </w:p>
+    <w:p>
+      <w:pPr>
+        <w:pStyle w:val="Heading2"/>
+        <w:keepNext w:val="0"/>
+        <w:spacing w:line="480" w:lineRule="auto" w:before="0" w:after="0"/>
+      </w:pPr>
+      <w:r>
+        <w:rPr>
+          <w:rFonts w:ascii="Times New Roman" w:hAnsi="Times New Roman" w:eastAsia="Times New Roman"/>
+          <w:color w:val="000000"/>
+          <w:sz w:val="22"/>
+        </w:rPr>
+        <w:t xml:space="preserve">6. Conclusion</w:t>
+      </w:r>
+    </w:p>
+    <w:p>
+      <w:pPr>
+        <w:pStyle w:val="FirstParagraph"/>
+        <w:keepNext w:val="0"/>
+        <w:spacing w:line="480" w:lineRule="auto" w:before="0" w:after="0"/>
+      </w:pPr>
+      <w:r>
+        <w:rPr>
+          <w:rFonts w:ascii="Times New Roman" w:hAnsi="Times New Roman" w:eastAsia="Times New Roman"/>
+          <w:color w:val="000000"/>
+          <w:sz w:val="22"/>
+        </w:rPr>
+        <w:t xml:space="preserve">This paper examined AI-generated visual content, source judgement, and media trust through a</w:t>
+      </w:r>
+      <w:r>
+        <w:rPr>
+          <w:rFonts w:ascii="Times New Roman" w:hAnsi="Times New Roman" w:eastAsia="Times New Roman"/>
+          <w:color w:val="000000"/>
+          <w:sz w:val="22"/>
+        </w:rPr>
+        <w:t xml:space="preserve"> </w:t>
+      </w:r>
+      <w:r>
+        <w:rPr>
+          <w:rFonts w:ascii="Times New Roman" w:hAnsi="Times New Roman" w:eastAsia="Times New Roman"/>
+          <w:color w:val="000000"/>
+          <w:sz w:val="22"/>
+        </w:rPr>
+        <w:t xml:space="preserve">combination of previous research and a small-scale local survey. The survey results suggest</w:t>
+      </w:r>
+      <w:r>
+        <w:rPr>
+          <w:rFonts w:ascii="Times New Roman" w:hAnsi="Times New Roman" w:eastAsia="Times New Roman"/>
+          <w:color w:val="000000"/>
+          <w:sz w:val="22"/>
+        </w:rPr>
+        <w:t xml:space="preserve"> </w:t>
+      </w:r>
+      <w:r>
+        <w:rPr>
+          <w:rFonts w:ascii="Times New Roman" w:hAnsi="Times New Roman" w:eastAsia="Times New Roman"/>
+          <w:color w:val="000000"/>
+          <w:sz w:val="22"/>
+        </w:rPr>
+        <w:t xml:space="preserve">that university-level respondents did not reliably distinguish AI-generated images from real</w:t>
+      </w:r>
+      <w:r>
+        <w:rPr>
+          <w:rFonts w:ascii="Times New Roman" w:hAnsi="Times New Roman" w:eastAsia="Times New Roman"/>
+          <w:color w:val="000000"/>
+          <w:sz w:val="22"/>
+        </w:rPr>
+        <w:t xml:space="preserve"> </w:t>
+      </w:r>
+      <w:r>
+        <w:rPr>
+          <w:rFonts w:ascii="Times New Roman" w:hAnsi="Times New Roman" w:eastAsia="Times New Roman"/>
+          <w:color w:val="000000"/>
+          <w:sz w:val="22"/>
+        </w:rPr>
+        <w:t xml:space="preserve">images. The overall accuracy rate was 47.4%, and real images were misclassified more often</w:t>
+      </w:r>
+      <w:r>
+        <w:rPr>
+          <w:rFonts w:ascii="Times New Roman" w:hAnsi="Times New Roman" w:eastAsia="Times New Roman"/>
+          <w:color w:val="000000"/>
+          <w:sz w:val="22"/>
+        </w:rPr>
+        <w:t xml:space="preserve"> </w:t>
+      </w:r>
+      <w:r>
+        <w:rPr>
+          <w:rFonts w:ascii="Times New Roman" w:hAnsi="Times New Roman" w:eastAsia="Times New Roman"/>
+          <w:color w:val="000000"/>
+          <w:sz w:val="22"/>
+        </w:rPr>
+        <w:t xml:space="preserve">than AI-generated images. Trust ratings were also moderate, with only a small difference</w:t>
+      </w:r>
+      <w:r>
+        <w:rPr>
+          <w:rFonts w:ascii="Times New Roman" w:hAnsi="Times New Roman" w:eastAsia="Times New Roman"/>
+          <w:color w:val="000000"/>
+          <w:sz w:val="22"/>
+        </w:rPr>
+        <w:t xml:space="preserve"> </w:t>
+      </w:r>
+      <w:r>
+        <w:rPr>
+          <w:rFonts w:ascii="Times New Roman" w:hAnsi="Times New Roman" w:eastAsia="Times New Roman"/>
+          <w:color w:val="000000"/>
+          <w:sz w:val="22"/>
+        </w:rPr>
+        <w:t xml:space="preserve">between real and AI-generated images.</w:t>
       </w:r>
     </w:p>
     <w:p>
@@ -6765,759 +7749,155 @@
           <w:color w:val="000000"/>
           <w:sz w:val="22"/>
         </w:rPr>
-        <w:t xml:space="preserve">A third explanation concerns material creation route. In the AI-first matched-real route, the</w:t>
-      </w:r>
-      <w:r>
-        <w:rPr>
-          <w:rFonts w:ascii="Times New Roman" w:hAnsi="Times New Roman" w:eastAsia="Times New Roman"/>
-          <w:color w:val="000000"/>
-          <w:sz w:val="22"/>
-        </w:rPr>
-        <w:t xml:space="preserve"> </w:t>
-      </w:r>
-      <w:r>
-        <w:rPr>
-          <w:rFonts w:ascii="Times New Roman" w:hAnsi="Times New Roman" w:eastAsia="Times New Roman"/>
-          <w:color w:val="000000"/>
-          <w:sz w:val="22"/>
-        </w:rPr>
-        <w:t xml:space="preserve">AI images may have retained more visible synthetic features, which could explain why they were</w:t>
-      </w:r>
-      <w:r>
-        <w:rPr>
-          <w:rFonts w:ascii="Times New Roman" w:hAnsi="Times New Roman" w:eastAsia="Times New Roman"/>
-          <w:color w:val="000000"/>
-          <w:sz w:val="22"/>
-        </w:rPr>
-        <w:t xml:space="preserve"> </w:t>
-      </w:r>
-      <w:r>
-        <w:rPr>
-          <w:rFonts w:ascii="Times New Roman" w:hAnsi="Times New Roman" w:eastAsia="Times New Roman"/>
-          <w:color w:val="000000"/>
-          <w:sz w:val="22"/>
-        </w:rPr>
-        <w:t xml:space="preserve">identified more accurately. In the real-to-AI modification route, however, the AI image was</w:t>
-      </w:r>
-      <w:r>
-        <w:rPr>
-          <w:rFonts w:ascii="Times New Roman" w:hAnsi="Times New Roman" w:eastAsia="Times New Roman"/>
-          <w:color w:val="000000"/>
-          <w:sz w:val="22"/>
-        </w:rPr>
-        <w:t xml:space="preserve"> </w:t>
-      </w:r>
-      <w:r>
-        <w:rPr>
-          <w:rFonts w:ascii="Times New Roman" w:hAnsi="Times New Roman" w:eastAsia="Times New Roman"/>
-          <w:color w:val="000000"/>
-          <w:sz w:val="22"/>
-        </w:rPr>
-        <w:t xml:space="preserve">based on a real reference. This may have preserved natural composition, lighting, or platform</w:t>
-      </w:r>
-      <w:r>
-        <w:rPr>
-          <w:rFonts w:ascii="Times New Roman" w:hAnsi="Times New Roman" w:eastAsia="Times New Roman"/>
-          <w:color w:val="000000"/>
-          <w:sz w:val="22"/>
-        </w:rPr>
-        <w:t xml:space="preserve"> </w:t>
-      </w:r>
-      <w:r>
-        <w:rPr>
-          <w:rFonts w:ascii="Times New Roman" w:hAnsi="Times New Roman" w:eastAsia="Times New Roman"/>
-          <w:color w:val="000000"/>
-          <w:sz w:val="22"/>
-        </w:rPr>
-        <w:t xml:space="preserve">layout, making the AI-modified image more believable. This interpretation remains tentative</w:t>
-      </w:r>
-      <w:r>
-        <w:rPr>
-          <w:rFonts w:ascii="Times New Roman" w:hAnsi="Times New Roman" w:eastAsia="Times New Roman"/>
-          <w:color w:val="000000"/>
-          <w:sz w:val="22"/>
-        </w:rPr>
-        <w:t xml:space="preserve"> </w:t>
-      </w:r>
-      <w:r>
-        <w:rPr>
-          <w:rFonts w:ascii="Times New Roman" w:hAnsi="Times New Roman" w:eastAsia="Times New Roman"/>
-          <w:color w:val="000000"/>
-          <w:sz w:val="22"/>
-        </w:rPr>
-        <w:t xml:space="preserve">because the route variable was not experimentally controlled.</w:t>
+        <w:t xml:space="preserve">The main implication is that the social risk of AI-generated visual content is broader than</w:t>
+      </w:r>
+      <w:r>
+        <w:rPr>
+          <w:rFonts w:ascii="Times New Roman" w:hAnsi="Times New Roman" w:eastAsia="Times New Roman"/>
+          <w:color w:val="000000"/>
+          <w:sz w:val="22"/>
+        </w:rPr>
+        <w:t xml:space="preserve"> </w:t>
+      </w:r>
+      <w:r>
+        <w:rPr>
+          <w:rFonts w:ascii="Times New Roman" w:hAnsi="Times New Roman" w:eastAsia="Times New Roman"/>
+          <w:color w:val="000000"/>
+          <w:sz w:val="22"/>
+        </w:rPr>
+        <w:t xml:space="preserve">the production of false images. As synthetic images become more realistic, real visual</w:t>
+      </w:r>
+      <w:r>
+        <w:rPr>
+          <w:rFonts w:ascii="Times New Roman" w:hAnsi="Times New Roman" w:eastAsia="Times New Roman"/>
+          <w:color w:val="000000"/>
+          <w:sz w:val="22"/>
+        </w:rPr>
+        <w:t xml:space="preserve"> </w:t>
+      </w:r>
+      <w:r>
+        <w:rPr>
+          <w:rFonts w:ascii="Times New Roman" w:hAnsi="Times New Roman" w:eastAsia="Times New Roman"/>
+          <w:color w:val="000000"/>
+          <w:sz w:val="22"/>
+        </w:rPr>
+        <w:t xml:space="preserve">evidence may also become easier to doubt. The route analysis further suggests that</w:t>
+      </w:r>
+      <w:r>
+        <w:rPr>
+          <w:rFonts w:ascii="Times New Roman" w:hAnsi="Times New Roman" w:eastAsia="Times New Roman"/>
+          <w:color w:val="000000"/>
+          <w:sz w:val="22"/>
+        </w:rPr>
+        <w:t xml:space="preserve"> </w:t>
+      </w:r>
+      <w:r>
+        <w:rPr>
+          <w:rFonts w:ascii="Times New Roman" w:hAnsi="Times New Roman" w:eastAsia="Times New Roman"/>
+          <w:color w:val="000000"/>
+          <w:sz w:val="22"/>
+        </w:rPr>
+        <w:t xml:space="preserve">AI-modified versions of real-image references may be especially difficult to identify because</w:t>
+      </w:r>
+      <w:r>
+        <w:rPr>
+          <w:rFonts w:ascii="Times New Roman" w:hAnsi="Times New Roman" w:eastAsia="Times New Roman"/>
+          <w:color w:val="000000"/>
+          <w:sz w:val="22"/>
+        </w:rPr>
+        <w:t xml:space="preserve"> </w:t>
+      </w:r>
+      <w:r>
+        <w:rPr>
+          <w:rFonts w:ascii="Times New Roman" w:hAnsi="Times New Roman" w:eastAsia="Times New Roman"/>
+          <w:color w:val="000000"/>
+          <w:sz w:val="22"/>
+        </w:rPr>
+        <w:t xml:space="preserve">they can inherit realistic composition and contextual cues from the source material. This is</w:t>
+      </w:r>
+      <w:r>
+        <w:rPr>
+          <w:rFonts w:ascii="Times New Roman" w:hAnsi="Times New Roman" w:eastAsia="Times New Roman"/>
+          <w:color w:val="000000"/>
+          <w:sz w:val="22"/>
+        </w:rPr>
+        <w:t xml:space="preserve"> </w:t>
+      </w:r>
+      <w:r>
+        <w:rPr>
+          <w:rFonts w:ascii="Times New Roman" w:hAnsi="Times New Roman" w:eastAsia="Times New Roman"/>
+          <w:color w:val="000000"/>
+          <w:sz w:val="22"/>
+        </w:rPr>
+        <w:t xml:space="preserve">especially important for screenshot-like materials, which often carry platform cues that make</w:t>
+      </w:r>
+      <w:r>
+        <w:rPr>
+          <w:rFonts w:ascii="Times New Roman" w:hAnsi="Times New Roman" w:eastAsia="Times New Roman"/>
+          <w:color w:val="000000"/>
+          <w:sz w:val="22"/>
+        </w:rPr>
+        <w:t xml:space="preserve"> </w:t>
+      </w:r>
+      <w:r>
+        <w:rPr>
+          <w:rFonts w:ascii="Times New Roman" w:hAnsi="Times New Roman" w:eastAsia="Times New Roman"/>
+          <w:color w:val="000000"/>
+          <w:sz w:val="22"/>
+        </w:rPr>
+        <w:t xml:space="preserve">them appear socially credible. Ordinary visual judgement is therefore insufficient for</w:t>
+      </w:r>
+      <w:r>
+        <w:rPr>
+          <w:rFonts w:ascii="Times New Roman" w:hAnsi="Times New Roman" w:eastAsia="Times New Roman"/>
+          <w:color w:val="000000"/>
+          <w:sz w:val="22"/>
+        </w:rPr>
+        <w:t xml:space="preserve"> </w:t>
+      </w:r>
+      <w:r>
+        <w:rPr>
+          <w:rFonts w:ascii="Times New Roman" w:hAnsi="Times New Roman" w:eastAsia="Times New Roman"/>
+          <w:color w:val="000000"/>
+          <w:sz w:val="22"/>
+        </w:rPr>
+        <w:t xml:space="preserve">evaluating online images. A more effective response requires platform-level labeling,</w:t>
+      </w:r>
+      <w:r>
+        <w:rPr>
+          <w:rFonts w:ascii="Times New Roman" w:hAnsi="Times New Roman" w:eastAsia="Times New Roman"/>
+          <w:color w:val="000000"/>
+          <w:sz w:val="22"/>
+        </w:rPr>
+        <w:t xml:space="preserve"> </w:t>
+      </w:r>
+      <w:r>
+        <w:rPr>
+          <w:rFonts w:ascii="Times New Roman" w:hAnsi="Times New Roman" w:eastAsia="Times New Roman"/>
+          <w:color w:val="000000"/>
+          <w:sz w:val="22"/>
+        </w:rPr>
+        <w:t xml:space="preserve">stronger provenance systems, verification habits, and media literacy education that addresses</w:t>
+      </w:r>
+      <w:r>
+        <w:rPr>
+          <w:rFonts w:ascii="Times New Roman" w:hAnsi="Times New Roman" w:eastAsia="Times New Roman"/>
+          <w:color w:val="000000"/>
+          <w:sz w:val="22"/>
+        </w:rPr>
+        <w:t xml:space="preserve"> </w:t>
+      </w:r>
+      <w:r>
+        <w:rPr>
+          <w:rFonts w:ascii="Times New Roman" w:hAnsi="Times New Roman" w:eastAsia="Times New Roman"/>
+          <w:color w:val="000000"/>
+          <w:sz w:val="22"/>
+        </w:rPr>
+        <w:t xml:space="preserve">both fake images and fake visual contexts.</w:t>
       </w:r>
     </w:p>
-    <w:p>
-      <w:pPr>
-        <w:pStyle w:val="BodyText"/>
-        <w:keepNext w:val="0"/>
-        <w:spacing w:line="480" w:lineRule="auto" w:before="0" w:after="0"/>
-      </w:pPr>
-      <w:r>
-        <w:rPr>
-          <w:rFonts w:ascii="Times New Roman" w:hAnsi="Times New Roman" w:eastAsia="Times New Roman"/>
-          <w:color w:val="000000"/>
-          <w:sz w:val="22"/>
-        </w:rPr>
-        <w:t xml:space="preserve">A fourth explanation concerns visual context. Screenshot-like materials contain contextual</w:t>
-      </w:r>
-      <w:r>
-        <w:rPr>
-          <w:rFonts w:ascii="Times New Roman" w:hAnsi="Times New Roman" w:eastAsia="Times New Roman"/>
-          <w:color w:val="000000"/>
-          <w:sz w:val="22"/>
-        </w:rPr>
-        <w:t xml:space="preserve"> </w:t>
-      </w:r>
-      <w:r>
-        <w:rPr>
-          <w:rFonts w:ascii="Times New Roman" w:hAnsi="Times New Roman" w:eastAsia="Times New Roman"/>
-          <w:color w:val="000000"/>
-          <w:sz w:val="22"/>
-        </w:rPr>
-        <w:t xml:space="preserve">cues, such as usernames, comments, platform layout, product labels, prices, or livestream</w:t>
-      </w:r>
-      <w:r>
-        <w:rPr>
-          <w:rFonts w:ascii="Times New Roman" w:hAnsi="Times New Roman" w:eastAsia="Times New Roman"/>
-          <w:color w:val="000000"/>
-          <w:sz w:val="22"/>
-        </w:rPr>
-        <w:t xml:space="preserve"> </w:t>
-      </w:r>
-      <w:r>
-        <w:rPr>
-          <w:rFonts w:ascii="Times New Roman" w:hAnsi="Times New Roman" w:eastAsia="Times New Roman"/>
-          <w:color w:val="000000"/>
-          <w:sz w:val="22"/>
-        </w:rPr>
-        <w:t xml:space="preserve">interfaces. These cues can make an image feel less like a standalone picture and more like a</w:t>
-      </w:r>
-      <w:r>
-        <w:rPr>
-          <w:rFonts w:ascii="Times New Roman" w:hAnsi="Times New Roman" w:eastAsia="Times New Roman"/>
-          <w:color w:val="000000"/>
-          <w:sz w:val="22"/>
-        </w:rPr>
-        <w:t xml:space="preserve"> </w:t>
-      </w:r>
-      <w:r>
-        <w:rPr>
-          <w:rFonts w:ascii="Times New Roman" w:hAnsi="Times New Roman" w:eastAsia="Times New Roman"/>
-          <w:color w:val="000000"/>
-          <w:sz w:val="22"/>
-        </w:rPr>
-        <w:t xml:space="preserve">record of an online event. Even when viewers are uncertain about the source of an image, such</w:t>
-      </w:r>
-      <w:r>
-        <w:rPr>
-          <w:rFonts w:ascii="Times New Roman" w:hAnsi="Times New Roman" w:eastAsia="Times New Roman"/>
-          <w:color w:val="000000"/>
-          <w:sz w:val="22"/>
-        </w:rPr>
-        <w:t xml:space="preserve"> </w:t>
-      </w:r>
-      <w:r>
-        <w:rPr>
-          <w:rFonts w:ascii="Times New Roman" w:hAnsi="Times New Roman" w:eastAsia="Times New Roman"/>
-          <w:color w:val="000000"/>
-          <w:sz w:val="22"/>
-        </w:rPr>
-        <w:t xml:space="preserve">contextual cues may increase the image’s perceived credibility.</w:t>
-      </w:r>
-    </w:p>
-    <w:bookmarkEnd w:id="43"/>
-    <w:bookmarkStart w:id="44" w:name="limitations-and-implications"/>
-    <w:p>
-      <w:pPr>
-        <w:pStyle w:val="Heading3"/>
-        <w:keepNext w:val="0"/>
-        <w:spacing w:line="480" w:lineRule="auto" w:before="0" w:after="0"/>
-      </w:pPr>
-      <w:r>
-        <w:rPr>
-          <w:rFonts w:ascii="Times New Roman" w:hAnsi="Times New Roman" w:eastAsia="Times New Roman"/>
-          <w:color w:val="000000"/>
-          <w:sz w:val="22"/>
-        </w:rPr>
-        <w:t xml:space="preserve">5.4 Limitations and Implications</w:t>
-      </w:r>
-    </w:p>
-    <w:p>
-      <w:pPr>
-        <w:pStyle w:val="FirstParagraph"/>
-        <w:keepNext w:val="0"/>
-        <w:spacing w:line="480" w:lineRule="auto" w:before="0" w:after="0"/>
-      </w:pPr>
-      <w:r>
-        <w:rPr>
-          <w:rFonts w:ascii="Times New Roman" w:hAnsi="Times New Roman" w:eastAsia="Times New Roman"/>
-          <w:color w:val="000000"/>
-          <w:sz w:val="22"/>
-        </w:rPr>
-        <w:t xml:space="preserve">Several limitations should be acknowledged. First, the survey used a small convenience sample</w:t>
-      </w:r>
-      <w:r>
-        <w:rPr>
-          <w:rFonts w:ascii="Times New Roman" w:hAnsi="Times New Roman" w:eastAsia="Times New Roman"/>
-          <w:color w:val="000000"/>
-          <w:sz w:val="22"/>
-        </w:rPr>
-        <w:t xml:space="preserve"> </w:t>
-      </w:r>
-      <w:r>
-        <w:rPr>
-          <w:rFonts w:ascii="Times New Roman" w:hAnsi="Times New Roman" w:eastAsia="Times New Roman"/>
-          <w:color w:val="000000"/>
-          <w:sz w:val="22"/>
-        </w:rPr>
-        <w:t xml:space="preserve">of university-level respondents, so the findings should not be generalized to all social</w:t>
-      </w:r>
-      <w:r>
-        <w:rPr>
-          <w:rFonts w:ascii="Times New Roman" w:hAnsi="Times New Roman" w:eastAsia="Times New Roman"/>
-          <w:color w:val="000000"/>
-          <w:sz w:val="22"/>
-        </w:rPr>
-        <w:t xml:space="preserve"> </w:t>
-      </w:r>
-      <w:r>
-        <w:rPr>
-          <w:rFonts w:ascii="Times New Roman" w:hAnsi="Times New Roman" w:eastAsia="Times New Roman"/>
-          <w:color w:val="000000"/>
-          <w:sz w:val="22"/>
-        </w:rPr>
-        <w:t xml:space="preserve">media users. Second, the stimulus set contained only 18 images, and differences in topic,</w:t>
-      </w:r>
-      <w:r>
-        <w:rPr>
-          <w:rFonts w:ascii="Times New Roman" w:hAnsi="Times New Roman" w:eastAsia="Times New Roman"/>
-          <w:color w:val="000000"/>
-          <w:sz w:val="22"/>
-        </w:rPr>
-        <w:t xml:space="preserve"> </w:t>
-      </w:r>
-      <w:r>
-        <w:rPr>
-          <w:rFonts w:ascii="Times New Roman" w:hAnsi="Times New Roman" w:eastAsia="Times New Roman"/>
-          <w:color w:val="000000"/>
-          <w:sz w:val="22"/>
-        </w:rPr>
-        <w:t xml:space="preserve">image quality, platform style, and visual familiarity may have influenced respondents’</w:t>
-      </w:r>
-      <w:r>
-        <w:rPr>
-          <w:rFonts w:ascii="Times New Roman" w:hAnsi="Times New Roman" w:eastAsia="Times New Roman"/>
-          <w:color w:val="000000"/>
-          <w:sz w:val="22"/>
-        </w:rPr>
-        <w:t xml:space="preserve"> </w:t>
-      </w:r>
-      <w:r>
-        <w:rPr>
-          <w:rFonts w:ascii="Times New Roman" w:hAnsi="Times New Roman" w:eastAsia="Times New Roman"/>
-          <w:color w:val="000000"/>
-          <w:sz w:val="22"/>
-        </w:rPr>
-        <w:t xml:space="preserve">judgements. Third, the two material creation routes were not randomly assigned or evenly</w:t>
-      </w:r>
-      <w:r>
-        <w:rPr>
-          <w:rFonts w:ascii="Times New Roman" w:hAnsi="Times New Roman" w:eastAsia="Times New Roman"/>
-          <w:color w:val="000000"/>
-          <w:sz w:val="22"/>
-        </w:rPr>
-        <w:t xml:space="preserve"> </w:t>
-      </w:r>
-      <w:r>
-        <w:rPr>
-          <w:rFonts w:ascii="Times New Roman" w:hAnsi="Times New Roman" w:eastAsia="Times New Roman"/>
-          <w:color w:val="000000"/>
-          <w:sz w:val="22"/>
-        </w:rPr>
-        <w:t xml:space="preserve">distributed across all categories, so the route analysis should be interpreted as exploratory.</w:t>
-      </w:r>
-      <w:r>
-        <w:rPr>
-          <w:rFonts w:ascii="Times New Roman" w:hAnsi="Times New Roman" w:eastAsia="Times New Roman"/>
-          <w:color w:val="000000"/>
-          <w:sz w:val="22"/>
-        </w:rPr>
-        <w:t xml:space="preserve"> </w:t>
-      </w:r>
-      <w:r>
-        <w:rPr>
-          <w:rFonts w:ascii="Times New Roman" w:hAnsi="Times New Roman" w:eastAsia="Times New Roman"/>
-          <w:color w:val="000000"/>
-          <w:sz w:val="22"/>
-        </w:rPr>
-        <w:t xml:space="preserve">Fourth, the original prompts used to generate the AI images were not fully preserved. The</w:t>
-      </w:r>
-      <w:r>
-        <w:rPr>
-          <w:rFonts w:ascii="Times New Roman" w:hAnsi="Times New Roman" w:eastAsia="Times New Roman"/>
-          <w:color w:val="000000"/>
-          <w:sz w:val="22"/>
-        </w:rPr>
-        <w:t xml:space="preserve"> </w:t>
-      </w:r>
-      <w:r>
-        <w:rPr>
-          <w:rFonts w:ascii="Times New Roman" w:hAnsi="Times New Roman" w:eastAsia="Times New Roman"/>
-          <w:color w:val="000000"/>
-          <w:sz w:val="22"/>
-        </w:rPr>
-        <w:t xml:space="preserve">prompt appendix therefore provides reconstructed documentation rather than an exact record of</w:t>
-      </w:r>
-      <w:r>
-        <w:rPr>
-          <w:rFonts w:ascii="Times New Roman" w:hAnsi="Times New Roman" w:eastAsia="Times New Roman"/>
-          <w:color w:val="000000"/>
-          <w:sz w:val="22"/>
-        </w:rPr>
-        <w:t xml:space="preserve"> </w:t>
-      </w:r>
-      <w:r>
-        <w:rPr>
-          <w:rFonts w:ascii="Times New Roman" w:hAnsi="Times New Roman" w:eastAsia="Times New Roman"/>
-          <w:color w:val="000000"/>
-          <w:sz w:val="22"/>
-        </w:rPr>
-        <w:t xml:space="preserve">the original generation process. Finally, because the study used descriptive statistics, it</w:t>
-      </w:r>
-      <w:r>
-        <w:rPr>
-          <w:rFonts w:ascii="Times New Roman" w:hAnsi="Times New Roman" w:eastAsia="Times New Roman"/>
-          <w:color w:val="000000"/>
-          <w:sz w:val="22"/>
-        </w:rPr>
-        <w:t xml:space="preserve"> </w:t>
-      </w:r>
-      <w:r>
-        <w:rPr>
-          <w:rFonts w:ascii="Times New Roman" w:hAnsi="Times New Roman" w:eastAsia="Times New Roman"/>
-          <w:color w:val="000000"/>
-          <w:sz w:val="22"/>
-        </w:rPr>
-        <w:t xml:space="preserve">cannot establish causal relationships between image type, trust, production route, and source</w:t>
-      </w:r>
-      <w:r>
-        <w:rPr>
-          <w:rFonts w:ascii="Times New Roman" w:hAnsi="Times New Roman" w:eastAsia="Times New Roman"/>
-          <w:color w:val="000000"/>
-          <w:sz w:val="22"/>
-        </w:rPr>
-        <w:t xml:space="preserve"> </w:t>
-      </w:r>
-      <w:r>
-        <w:rPr>
-          <w:rFonts w:ascii="Times New Roman" w:hAnsi="Times New Roman" w:eastAsia="Times New Roman"/>
-          <w:color w:val="000000"/>
-          <w:sz w:val="22"/>
-        </w:rPr>
-        <w:t xml:space="preserve">judgement.</w:t>
-      </w:r>
-    </w:p>
-    <w:p>
-      <w:pPr>
-        <w:pStyle w:val="BodyText"/>
-        <w:keepNext w:val="0"/>
-        <w:spacing w:line="480" w:lineRule="auto" w:before="0" w:after="0"/>
-      </w:pPr>
-      <w:r>
-        <w:rPr>
-          <w:rFonts w:ascii="Times New Roman" w:hAnsi="Times New Roman" w:eastAsia="Times New Roman"/>
-          <w:color w:val="000000"/>
-          <w:sz w:val="22"/>
-        </w:rPr>
-        <w:t xml:space="preserve">Despite these limitations, the findings have practical implications. Platforms and educators</w:t>
-      </w:r>
-      <w:r>
-        <w:rPr>
-          <w:rFonts w:ascii="Times New Roman" w:hAnsi="Times New Roman" w:eastAsia="Times New Roman"/>
-          <w:color w:val="000000"/>
-          <w:sz w:val="22"/>
-        </w:rPr>
-        <w:t xml:space="preserve"> </w:t>
-      </w:r>
-      <w:r>
-        <w:rPr>
-          <w:rFonts w:ascii="Times New Roman" w:hAnsi="Times New Roman" w:eastAsia="Times New Roman"/>
-          <w:color w:val="000000"/>
-          <w:sz w:val="22"/>
-        </w:rPr>
-        <w:t xml:space="preserve">should not assume that users can reliably identify AI-generated images through visual</w:t>
-      </w:r>
-      <w:r>
-        <w:rPr>
-          <w:rFonts w:ascii="Times New Roman" w:hAnsi="Times New Roman" w:eastAsia="Times New Roman"/>
-          <w:color w:val="000000"/>
-          <w:sz w:val="22"/>
-        </w:rPr>
-        <w:t xml:space="preserve"> </w:t>
-      </w:r>
-      <w:r>
-        <w:rPr>
-          <w:rFonts w:ascii="Times New Roman" w:hAnsi="Times New Roman" w:eastAsia="Times New Roman"/>
-          <w:color w:val="000000"/>
-          <w:sz w:val="22"/>
-        </w:rPr>
-        <w:t xml:space="preserve">inspection alone. Media literacy education should teach users to verify sources and contexts,</w:t>
-      </w:r>
-      <w:r>
-        <w:rPr>
-          <w:rFonts w:ascii="Times New Roman" w:hAnsi="Times New Roman" w:eastAsia="Times New Roman"/>
-          <w:color w:val="000000"/>
-          <w:sz w:val="22"/>
-        </w:rPr>
-        <w:t xml:space="preserve"> </w:t>
-      </w:r>
-      <w:r>
-        <w:rPr>
-          <w:rFonts w:ascii="Times New Roman" w:hAnsi="Times New Roman" w:eastAsia="Times New Roman"/>
-          <w:color w:val="000000"/>
-          <w:sz w:val="22"/>
-        </w:rPr>
-        <w:t xml:space="preserve">not merely to search for visual flaws. Platform labels, content provenance systems, and</w:t>
-      </w:r>
-      <w:r>
-        <w:rPr>
-          <w:rFonts w:ascii="Times New Roman" w:hAnsi="Times New Roman" w:eastAsia="Times New Roman"/>
-          <w:color w:val="000000"/>
-          <w:sz w:val="22"/>
-        </w:rPr>
-        <w:t xml:space="preserve"> </w:t>
-      </w:r>
-      <w:r>
-        <w:rPr>
-          <w:rFonts w:ascii="Times New Roman" w:hAnsi="Times New Roman" w:eastAsia="Times New Roman"/>
-          <w:color w:val="000000"/>
-          <w:sz w:val="22"/>
-        </w:rPr>
-        <w:t xml:space="preserve">watermarking may also help, but they should be treated as part of a broader response rather</w:t>
-      </w:r>
-      <w:r>
-        <w:rPr>
-          <w:rFonts w:ascii="Times New Roman" w:hAnsi="Times New Roman" w:eastAsia="Times New Roman"/>
-          <w:color w:val="000000"/>
-          <w:sz w:val="22"/>
-        </w:rPr>
-        <w:t xml:space="preserve"> </w:t>
-      </w:r>
-      <w:r>
-        <w:rPr>
-          <w:rFonts w:ascii="Times New Roman" w:hAnsi="Times New Roman" w:eastAsia="Times New Roman"/>
-          <w:color w:val="000000"/>
-          <w:sz w:val="22"/>
-        </w:rPr>
-        <w:t xml:space="preserve">than as a complete solution. As images move across platforms, are compressed, edited, or</w:t>
-      </w:r>
-      <w:r>
-        <w:rPr>
-          <w:rFonts w:ascii="Times New Roman" w:hAnsi="Times New Roman" w:eastAsia="Times New Roman"/>
-          <w:color w:val="000000"/>
-          <w:sz w:val="22"/>
-        </w:rPr>
-        <w:t xml:space="preserve"> </w:t>
-      </w:r>
-      <w:r>
-        <w:rPr>
-          <w:rFonts w:ascii="Times New Roman" w:hAnsi="Times New Roman" w:eastAsia="Times New Roman"/>
-          <w:color w:val="000000"/>
-          <w:sz w:val="22"/>
-        </w:rPr>
-        <w:t xml:space="preserve">screenshotted, the reliability of provenance signals may vary.</w:t>
-      </w:r>
-    </w:p>
-    <w:bookmarkEnd w:id="44"/>
-    <w:bookmarkEnd w:id="45"/>
-    <w:bookmarkStart w:id="46" w:name="conclusion"/>
-    <w:p>
-      <w:pPr>
-        <w:keepNext w:val="0"/>
-        <w:spacing w:line="480" w:lineRule="auto" w:before="0" w:after="0"/>
-      </w:pPr>
-      <w:r>
-        <w:rPr>
-          <w:rFonts w:ascii="Times New Roman" w:hAnsi="Times New Roman" w:eastAsia="Times New Roman"/>
-          <w:color w:val="000000"/>
-          <w:sz w:val="22"/>
-        </w:rPr>
-        <w:br w:type="page"/>
-      </w:r>
-    </w:p>
-    <w:p>
-      <w:pPr>
-        <w:pStyle w:val="Heading2"/>
-        <w:keepNext w:val="0"/>
-        <w:spacing w:line="480" w:lineRule="auto" w:before="0" w:after="0"/>
-      </w:pPr>
-      <w:r>
-        <w:rPr>
-          <w:rFonts w:ascii="Times New Roman" w:hAnsi="Times New Roman" w:eastAsia="Times New Roman"/>
-          <w:color w:val="000000"/>
-          <w:sz w:val="22"/>
-        </w:rPr>
-        <w:t xml:space="preserve">6. Conclusion</w:t>
-      </w:r>
-    </w:p>
-    <w:p>
-      <w:pPr>
-        <w:pStyle w:val="FirstParagraph"/>
-        <w:keepNext w:val="0"/>
-        <w:spacing w:line="480" w:lineRule="auto" w:before="0" w:after="0"/>
-      </w:pPr>
-      <w:r>
-        <w:rPr>
-          <w:rFonts w:ascii="Times New Roman" w:hAnsi="Times New Roman" w:eastAsia="Times New Roman"/>
-          <w:color w:val="000000"/>
-          <w:sz w:val="22"/>
-        </w:rPr>
-        <w:t xml:space="preserve">This paper examined AI-generated visual content, source judgement, and media trust through a</w:t>
-      </w:r>
-      <w:r>
-        <w:rPr>
-          <w:rFonts w:ascii="Times New Roman" w:hAnsi="Times New Roman" w:eastAsia="Times New Roman"/>
-          <w:color w:val="000000"/>
-          <w:sz w:val="22"/>
-        </w:rPr>
-        <w:t xml:space="preserve"> </w:t>
-      </w:r>
-      <w:r>
-        <w:rPr>
-          <w:rFonts w:ascii="Times New Roman" w:hAnsi="Times New Roman" w:eastAsia="Times New Roman"/>
-          <w:color w:val="000000"/>
-          <w:sz w:val="22"/>
-        </w:rPr>
-        <w:t xml:space="preserve">combination of previous research and a small-scale local survey. The survey results suggest</w:t>
-      </w:r>
-      <w:r>
-        <w:rPr>
-          <w:rFonts w:ascii="Times New Roman" w:hAnsi="Times New Roman" w:eastAsia="Times New Roman"/>
-          <w:color w:val="000000"/>
-          <w:sz w:val="22"/>
-        </w:rPr>
-        <w:t xml:space="preserve"> </w:t>
-      </w:r>
-      <w:r>
-        <w:rPr>
-          <w:rFonts w:ascii="Times New Roman" w:hAnsi="Times New Roman" w:eastAsia="Times New Roman"/>
-          <w:color w:val="000000"/>
-          <w:sz w:val="22"/>
-        </w:rPr>
-        <w:t xml:space="preserve">that university-level respondents did not reliably distinguish AI-generated images from real</w:t>
-      </w:r>
-      <w:r>
-        <w:rPr>
-          <w:rFonts w:ascii="Times New Roman" w:hAnsi="Times New Roman" w:eastAsia="Times New Roman"/>
-          <w:color w:val="000000"/>
-          <w:sz w:val="22"/>
-        </w:rPr>
-        <w:t xml:space="preserve"> </w:t>
-      </w:r>
-      <w:r>
-        <w:rPr>
-          <w:rFonts w:ascii="Times New Roman" w:hAnsi="Times New Roman" w:eastAsia="Times New Roman"/>
-          <w:color w:val="000000"/>
-          <w:sz w:val="22"/>
-        </w:rPr>
-        <w:t xml:space="preserve">images. The overall accuracy rate was 47.4%, and real images were misclassified more often</w:t>
-      </w:r>
-      <w:r>
-        <w:rPr>
-          <w:rFonts w:ascii="Times New Roman" w:hAnsi="Times New Roman" w:eastAsia="Times New Roman"/>
-          <w:color w:val="000000"/>
-          <w:sz w:val="22"/>
-        </w:rPr>
-        <w:t xml:space="preserve"> </w:t>
-      </w:r>
-      <w:r>
-        <w:rPr>
-          <w:rFonts w:ascii="Times New Roman" w:hAnsi="Times New Roman" w:eastAsia="Times New Roman"/>
-          <w:color w:val="000000"/>
-          <w:sz w:val="22"/>
-        </w:rPr>
-        <w:t xml:space="preserve">than AI-generated images. Trust ratings were also moderate, with only a small difference</w:t>
-      </w:r>
-      <w:r>
-        <w:rPr>
-          <w:rFonts w:ascii="Times New Roman" w:hAnsi="Times New Roman" w:eastAsia="Times New Roman"/>
-          <w:color w:val="000000"/>
-          <w:sz w:val="22"/>
-        </w:rPr>
-        <w:t xml:space="preserve"> </w:t>
-      </w:r>
-      <w:r>
-        <w:rPr>
-          <w:rFonts w:ascii="Times New Roman" w:hAnsi="Times New Roman" w:eastAsia="Times New Roman"/>
-          <w:color w:val="000000"/>
-          <w:sz w:val="22"/>
-        </w:rPr>
-        <w:t xml:space="preserve">between real and AI-generated images.</w:t>
-      </w:r>
-    </w:p>
-    <w:p>
-      <w:pPr>
-        <w:pStyle w:val="BodyText"/>
-        <w:keepNext w:val="0"/>
-        <w:spacing w:line="480" w:lineRule="auto" w:before="0" w:after="0"/>
-      </w:pPr>
-      <w:r>
-        <w:rPr>
-          <w:rFonts w:ascii="Times New Roman" w:hAnsi="Times New Roman" w:eastAsia="Times New Roman"/>
-          <w:color w:val="000000"/>
-          <w:sz w:val="22"/>
-        </w:rPr>
-        <w:t xml:space="preserve">The main implication is that the social risk of AI-generated visual content is broader than</w:t>
-      </w:r>
-      <w:r>
-        <w:rPr>
-          <w:rFonts w:ascii="Times New Roman" w:hAnsi="Times New Roman" w:eastAsia="Times New Roman"/>
-          <w:color w:val="000000"/>
-          <w:sz w:val="22"/>
-        </w:rPr>
-        <w:t xml:space="preserve"> </w:t>
-      </w:r>
-      <w:r>
-        <w:rPr>
-          <w:rFonts w:ascii="Times New Roman" w:hAnsi="Times New Roman" w:eastAsia="Times New Roman"/>
-          <w:color w:val="000000"/>
-          <w:sz w:val="22"/>
-        </w:rPr>
-        <w:t xml:space="preserve">the production of false images. As synthetic images become more realistic, real visual</w:t>
-      </w:r>
-      <w:r>
-        <w:rPr>
-          <w:rFonts w:ascii="Times New Roman" w:hAnsi="Times New Roman" w:eastAsia="Times New Roman"/>
-          <w:color w:val="000000"/>
-          <w:sz w:val="22"/>
-        </w:rPr>
-        <w:t xml:space="preserve"> </w:t>
-      </w:r>
-      <w:r>
-        <w:rPr>
-          <w:rFonts w:ascii="Times New Roman" w:hAnsi="Times New Roman" w:eastAsia="Times New Roman"/>
-          <w:color w:val="000000"/>
-          <w:sz w:val="22"/>
-        </w:rPr>
-        <w:t xml:space="preserve">evidence may also become easier to doubt. The route analysis further suggests that</w:t>
-      </w:r>
-      <w:r>
-        <w:rPr>
-          <w:rFonts w:ascii="Times New Roman" w:hAnsi="Times New Roman" w:eastAsia="Times New Roman"/>
-          <w:color w:val="000000"/>
-          <w:sz w:val="22"/>
-        </w:rPr>
-        <w:t xml:space="preserve"> </w:t>
-      </w:r>
-      <w:r>
-        <w:rPr>
-          <w:rFonts w:ascii="Times New Roman" w:hAnsi="Times New Roman" w:eastAsia="Times New Roman"/>
-          <w:color w:val="000000"/>
-          <w:sz w:val="22"/>
-        </w:rPr>
-        <w:t xml:space="preserve">AI-modified versions of real-image references may be especially difficult to identify because</w:t>
-      </w:r>
-      <w:r>
-        <w:rPr>
-          <w:rFonts w:ascii="Times New Roman" w:hAnsi="Times New Roman" w:eastAsia="Times New Roman"/>
-          <w:color w:val="000000"/>
-          <w:sz w:val="22"/>
-        </w:rPr>
-        <w:t xml:space="preserve"> </w:t>
-      </w:r>
-      <w:r>
-        <w:rPr>
-          <w:rFonts w:ascii="Times New Roman" w:hAnsi="Times New Roman" w:eastAsia="Times New Roman"/>
-          <w:color w:val="000000"/>
-          <w:sz w:val="22"/>
-        </w:rPr>
-        <w:t xml:space="preserve">they can inherit realistic composition and contextual cues from the source material. This is</w:t>
-      </w:r>
-      <w:r>
-        <w:rPr>
-          <w:rFonts w:ascii="Times New Roman" w:hAnsi="Times New Roman" w:eastAsia="Times New Roman"/>
-          <w:color w:val="000000"/>
-          <w:sz w:val="22"/>
-        </w:rPr>
-        <w:t xml:space="preserve"> </w:t>
-      </w:r>
-      <w:r>
-        <w:rPr>
-          <w:rFonts w:ascii="Times New Roman" w:hAnsi="Times New Roman" w:eastAsia="Times New Roman"/>
-          <w:color w:val="000000"/>
-          <w:sz w:val="22"/>
-        </w:rPr>
-        <w:t xml:space="preserve">especially important for screenshot-like materials, which often carry platform cues that make</w:t>
-      </w:r>
-      <w:r>
-        <w:rPr>
-          <w:rFonts w:ascii="Times New Roman" w:hAnsi="Times New Roman" w:eastAsia="Times New Roman"/>
-          <w:color w:val="000000"/>
-          <w:sz w:val="22"/>
-        </w:rPr>
-        <w:t xml:space="preserve"> </w:t>
-      </w:r>
-      <w:r>
-        <w:rPr>
-          <w:rFonts w:ascii="Times New Roman" w:hAnsi="Times New Roman" w:eastAsia="Times New Roman"/>
-          <w:color w:val="000000"/>
-          <w:sz w:val="22"/>
-        </w:rPr>
-        <w:t xml:space="preserve">them appear socially credible. Ordinary visual judgement is therefore insufficient for</w:t>
-      </w:r>
-      <w:r>
-        <w:rPr>
-          <w:rFonts w:ascii="Times New Roman" w:hAnsi="Times New Roman" w:eastAsia="Times New Roman"/>
-          <w:color w:val="000000"/>
-          <w:sz w:val="22"/>
-        </w:rPr>
-        <w:t xml:space="preserve"> </w:t>
-      </w:r>
-      <w:r>
-        <w:rPr>
-          <w:rFonts w:ascii="Times New Roman" w:hAnsi="Times New Roman" w:eastAsia="Times New Roman"/>
-          <w:color w:val="000000"/>
-          <w:sz w:val="22"/>
-        </w:rPr>
-        <w:t xml:space="preserve">evaluating online images. A more effective response requires platform-level labeling,</w:t>
-      </w:r>
-      <w:r>
-        <w:rPr>
-          <w:rFonts w:ascii="Times New Roman" w:hAnsi="Times New Roman" w:eastAsia="Times New Roman"/>
-          <w:color w:val="000000"/>
-          <w:sz w:val="22"/>
-        </w:rPr>
-        <w:t xml:space="preserve"> </w:t>
-      </w:r>
-      <w:r>
-        <w:rPr>
-          <w:rFonts w:ascii="Times New Roman" w:hAnsi="Times New Roman" w:eastAsia="Times New Roman"/>
-          <w:color w:val="000000"/>
-          <w:sz w:val="22"/>
-        </w:rPr>
-        <w:t xml:space="preserve">stronger provenance systems, verification habits, and media literacy education that addresses</w:t>
-      </w:r>
-      <w:r>
-        <w:rPr>
-          <w:rFonts w:ascii="Times New Roman" w:hAnsi="Times New Roman" w:eastAsia="Times New Roman"/>
-          <w:color w:val="000000"/>
-          <w:sz w:val="22"/>
-        </w:rPr>
-        <w:t xml:space="preserve"> </w:t>
-      </w:r>
-      <w:r>
-        <w:rPr>
-          <w:rFonts w:ascii="Times New Roman" w:hAnsi="Times New Roman" w:eastAsia="Times New Roman"/>
-          <w:color w:val="000000"/>
-          <w:sz w:val="22"/>
-        </w:rPr>
-        <w:t xml:space="preserve">both fake images and fake visual contexts.</w:t>
-      </w:r>
-    </w:p>
-    <w:bookmarkEnd w:id="46"/>
-    <w:bookmarkStart w:id="47" w:name="references"/>
+    <w:bookmarkEnd w:id="49"/>
+    <w:bookmarkStart w:id="50" w:name="references"/>
     <w:p>
       <w:pPr>
         <w:keepNext w:val="0"/>
@@ -8639,8 +9019,8 @@
         <w:t xml:space="preserve">(6380), 1146-1151. https://doi.org/10.1126/science.aap9559</w:t>
       </w:r>
     </w:p>
-    <w:bookmarkEnd w:id="47"/>
-    <w:bookmarkStart w:id="48" w:name="Xd27b500da865e2ef2467a97cf42ff81cb891aee"/>
+    <w:bookmarkEnd w:id="50"/>
+    <w:bookmarkStart w:id="51" w:name="Xd27b500da865e2ef2467a97cf42ff81cb891aee"/>
     <w:p>
       <w:pPr>
         <w:keepNext w:val="0"/>
@@ -10216,8 +10596,8 @@
         <w:t xml:space="preserve">.</w:t>
       </w:r>
     </w:p>
-    <w:bookmarkEnd w:id="48"/>
-    <w:bookmarkStart w:id="49" w:name="X7c98da5d1f61ba758cb5e875088fddc09b69ac9"/>
+    <w:bookmarkEnd w:id="51"/>
+    <w:bookmarkStart w:id="52" w:name="X7c98da5d1f61ba758cb5e875088fddc09b69ac9"/>
     <w:p>
       <w:pPr>
         <w:pStyle w:val="Heading2"/>
@@ -11020,8 +11400,8 @@
         <w:t xml:space="preserve">livestream screen capture rather than a standalone illustration.</w:t>
       </w:r>
     </w:p>
-    <w:bookmarkEnd w:id="49"/>
-    <w:bookmarkStart w:id="50" w:name="Xaea563967333c14aa00483d8a5cc371bc2efcf7"/>
+    <w:bookmarkEnd w:id="52"/>
+    <w:bookmarkStart w:id="53" w:name="Xaea563967333c14aa00483d8a5cc371bc2efcf7"/>
     <w:p>
       <w:pPr>
         <w:pStyle w:val="Heading2"/>
@@ -12118,8 +12498,8 @@
         </w:tc>
       </w:tr>
     </w:tbl>
-    <w:bookmarkEnd w:id="50"/>
-    <w:bookmarkEnd w:id="51"/>
+    <w:bookmarkEnd w:id="53"/>
+    <w:bookmarkEnd w:id="54"/>
     <w:sectPr>
       <w:footerReference w:type="default" r:id="rId9"/>
       <w:pgMar w:top="1440" w:bottom="1440" w:left="1440" w:right="1440"/>

</xml_diff>